<commit_message>
chore: checkpoint v3 manuscript and v4 plan
</commit_message>
<xml_diff>
--- a/paper_draft_submission_v3_uestc_template.docx
+++ b/paper_draft_submission_v3_uestc_template.docx
@@ -9,7 +9,7 @@
     </w:p>
     <w:p>
       <w:pPr>
-        <w:pStyle w:val="7"/>
+        <w:pStyle w:val="9"/>
       </w:pPr>
     </w:p>
     <w:p>
@@ -28,7 +28,7 @@
     </w:p>
     <w:p>
       <w:pPr>
-        <w:pStyle w:val="7"/>
+        <w:pStyle w:val="9"/>
       </w:pPr>
     </w:p>
     <w:p>
@@ -38,12 +38,12 @@
           <w:sz w:val="24"/>
           <w:szCs w:val="24"/>
         </w:rPr>
-        <w:t>Federated unlearning seeks to reduce the influence of a target client without fully retraining the federated model. In language-model federated instruction tuning, this problem is challenging because approximate unlearning must weaken the target-client signal while preserving utility on retained clients. We study a guarded post-training unlearning method built on the FedHDS federated fine-tuning backbone, with the contribution lying in the unlearning stage rather than in a new training algorithm. The method uses the target-client gradient to define the signal to be weakened, estimates curvature from a small retained-client reference set, and constrains the resulting second-order update through global norm clipping, stepped trust-region checking, direction probing, and a forget-loss guard. Experiments on Dolly with Qwen2-0.5B and Qwen2.5-1.5B show that forget-batch Hessian updates can produce stronger target-client loss increases but may incur substantial global-loss degradation. In contrast, retained-set curvature, when combined with direction correction and guard constraints, can improve target-client loss under controlled global loss. Scale and seed checks further indicate that the method is best interpreted as an auditable, utility-preserving approximate unlearning framework rather than a universally strongest forgetting algorithm; the exact forgetting gain remains sensitive to model scale, data scale, and random seed.</w:t>
-      </w:r>
-    </w:p>
-    <w:p>
-      <w:pPr>
-        <w:pStyle w:val="7"/>
+        <w:t>Federated unlearning seeks to reduce the influence of a target client without fully retraining the federated model. In language-model federated instruction tuning, the challenge is to weaken the forget signal while preserving retained-client utility. We study a guarded post-training unlearning method on top of FedHDS: the forget-client gradient defines what should be removed, retained-client curvature defines the utility-preserving geometry, and global norm clipping, stepped trust-region checking, direction probing, and a forget-loss guard control the update. In a five-seed main suite on Dolly with Qwen2-0.5B under Dirichlet alpha=0.5, forget-batch Hessian gives the strongest forgetting signal but is unstable, including one catastrophic utility failure and positive forgetting in only 4/5 valid seeds. By contrast, the retained-set negative-direction guarded update increases forget-client loss in 5/5 valid seeds while adding only +0.0618 mean global loss relative to the corresponding FedHDS baselines. GA and GA-guarded updates are stable but much weaker. Complementary scale checks with Qwen2.5-1.5B support a bounded conclusion: retained-set curvature becomes useful only after direction correction and guard control, and the method should be read as a utility-preserving approximate unlearning framework rather than as the strongest forgetting update in every regime.</w:t>
+      </w:r>
+    </w:p>
+    <w:p>
+      <w:pPr>
+        <w:pStyle w:val="9"/>
       </w:pPr>
     </w:p>
     <w:p>
@@ -53,7 +53,7 @@
     </w:p>
     <w:p>
       <w:pPr>
-        <w:pStyle w:val="7"/>
+        <w:pStyle w:val="9"/>
       </w:pPr>
     </w:p>
     <w:p>
@@ -72,7 +72,7 @@
     </w:p>
     <w:p>
       <w:pPr>
-        <w:pStyle w:val="7"/>
+        <w:pStyle w:val="9"/>
       </w:pPr>
       <w:r>
         <w:fldChar w:fldCharType="begin"/>
@@ -110,12 +110,30 @@
     </w:p>
     <w:p>
       <w:r>
-        <w:t>Federated learning allows multiple clients to collaboratively train a global model without directly sharing their local data[1]. This training paradigm is useful when data are distributed across users, institutions, or devices, and when centralizing the raw data is undesirable. However, a trained federated model may later face an unlearning request: a client may withdraw consent, request data deletion, or become invalid due to data quality or compliance concerns. In such a case, the system should remove or reduce the influence of that client from the global model.</w:t>
-      </w:r>
-    </w:p>
-    <w:p>
-      <w:r>
-        <w:t>The most direct solution is to retrain the federated model after excluding the target client[2]. Although retraining provides a clean reference, it is often impractical. Federated training may involve many communication rounds, repeated local fine-tuning, and large model checkpoints. The cost becomes even more pronounced for language-model fine-tuning, where even one full run can already require substantial computing resources and time. Federated unlearning therefore studies how to approximate the effect of removing a client without performing full retraining.</w:t>
+        <w:t>Federated learning allows multiple clients to collaboratively train a global model without directly sharing their local data</w:t>
+      </w:r>
+      <w:r>
+        <w:rPr>
+          <w:vertAlign w:val="superscript"/>
+        </w:rPr>
+        <w:t>[1]</w:t>
+      </w:r>
+      <w:r>
+        <w:t>. This training paradigm is useful when data are distributed across users, institutions, or devices, and when centralizing the raw data is undesirable. However, a trained federated model may later face an unlearning request: a client may withdraw consent, request data deletion, or become invalid due to data quality or compliance concerns. In such a case, the system should remove or reduce the influence of that client from the global model.</w:t>
+      </w:r>
+    </w:p>
+    <w:p>
+      <w:r>
+        <w:t>The most direct solution is to retrain the federated model after excluding the target client</w:t>
+      </w:r>
+      <w:r>
+        <w:rPr>
+          <w:vertAlign w:val="superscript"/>
+        </w:rPr>
+        <w:t>[2]</w:t>
+      </w:r>
+      <w:r>
+        <w:t>. Although retraining provides a clean reference, it is often impractical. Federated training may involve many communication rounds, repeated local fine-tuning, and large model checkpoints. The cost becomes even more pronounced for language-model fine-tuning, where even one full run can already require substantial computing resources and time. Federated unlearning therefore studies how to approximate the effect of removing a client without performing full retraining.</w:t>
       </w:r>
     </w:p>
     <w:p>
@@ -125,7 +143,16 @@
     </w:p>
     <w:p>
       <w:r>
-        <w:t>A central challenge in federated unlearning is the trade-off between forgetting and retained utility. An aggressive update may increase the loss on the forget client, but it can also damage performance on the retained clients. Conversely, an overly conservative update may preserve global utility but fail to meaningfully reduce the forgotten client's influence. This trade-off is especially important when second-order approximations are used: Hessian or inverse-Hessian-vector-product based updates can estimate parameter corrections for removing data influence[3][4], but the choice of curvature reference directly affects both the direction and magnitude of the unlearning update.</w:t>
+        <w:t>A central challenge in federated unlearning is the trade-off between forgetting and retained utility. An aggressive update may increase the loss on the forget client, but it can also damage performance on the retained clients. Conversely, an overly conservative update may preserve global utility but fail to meaningfully reduce the forgotten client's influence. This trade-off is especially important when second-order approximations are used: Hessian or inverse-Hessian-vector-product based updates can estimate parameter corrections for removing data influence</w:t>
+      </w:r>
+      <w:r>
+        <w:rPr>
+          <w:vertAlign w:val="superscript"/>
+        </w:rPr>
+        <w:t>[3][4]</w:t>
+      </w:r>
+      <w:r>
+        <w:t>, but the choice of curvature reference directly affects both the direction and magnitude of the unlearning update.</w:t>
       </w:r>
     </w:p>
     <w:p>
@@ -135,7 +162,16 @@
     </w:p>
     <w:p>
       <w:r>
-        <w:t>We adopt FedHDS, the federated data-efficient instruction-tuning backbone introduced by Qin et al.[5], and focus on post-training unlearning after the federated model has been obtained. Instead of estimating curvature only from the forget-client batch, the study uses retained clients to build a small reference set and approximate the curvature around the retained task distribution. The intuition is that the forget-client gradient defines what should be removed, while the retained-set curvature defines how the model should remain close to the utility-preserving region of the parameter space.</w:t>
+        <w:t>We adopt FedHDS, the federated data-efficient instruction-tuning backbone introduced by Qin et al</w:t>
+      </w:r>
+      <w:r>
+        <w:rPr>
+          <w:vertAlign w:val="superscript"/>
+        </w:rPr>
+        <w:t>[5]</w:t>
+      </w:r>
+      <w:r>
+        <w:t>, and focus on post-training unlearning after the federated model has been obtained. Instead of estimating curvature only from the forget-client batch, the study uses retained clients to build a small reference set and approximate the curvature around the retained task distribution. The intuition is that the forget-client gradient defines what should be removed, while the retained-set curvature defines how the model should remain close to the utility-preserving region of the parameter space.</w:t>
       </w:r>
     </w:p>
     <w:p>
@@ -145,7 +181,7 @@
     </w:p>
     <w:p>
       <w:r>
-        <w:t>The evaluation is intentionally narrow and focused. A feasibility study verifies the end-to-end pipeline, a main trade-off experiment compares forget-batch and retained-set curvature, a direction-and-guard ablation explains the sign problem, and brief scale and seed checks test whether the interpretation survives outside the core setting. The goal is not to exhaust every regime, but to determine whether retained-set curvature can support a controllable post-training unlearning update.</w:t>
+        <w:t>The evaluation is intentionally narrow and focused. A feasibility study verifies the end-to-end pipeline, a five-seed main-suite experiment under Dirichlet alpha=0.5 compares forget-batch and guarded retained-set updates, a direction-and-guard ablation explains the sign problem, and complementary scale checks test whether the interpretation survives outside the core setting. The goal is not to exhaust every regime, but to determine whether retained-set curvature can support a controllable post-training unlearning update.</w:t>
       </w:r>
     </w:p>
     <w:p>
@@ -165,7 +201,7 @@
     </w:p>
     <w:p>
       <w:r>
-        <w:t>3. Experiments support a bounded claim: the method is better understood as a utility-preserving and auditable approximate unlearning framework than as a universally strongest forgetting method, and its forgetting gain remains scale- and seed-sensitive.</w:t>
+        <w:t>3. A five-seed main-suite evaluation plus complementary scale checks support a bounded claim: the method is better understood as a utility-preserving and auditable approximate unlearning framework than as a universally strongest forgetting method, and its forgetting gain remains scale- and seed-sensitive.</w:t>
       </w:r>
     </w:p>
     <w:p>
@@ -186,17 +222,71 @@
     </w:p>
     <w:p>
       <w:r>
-        <w:t>Federated unlearning extends machine unlearning to decentralized training, where a removal request must be handled without reconstructing the full centralized dataset. Recent survey work emphasizes that successful unlearning should be judged not only by whether target influence is weakened, but also by whether the remaining model still preserves acceptable utility[6].</w:t>
-      </w:r>
-    </w:p>
-    <w:p>
-      <w:r>
-        <w:t>Existing federated-unlearning methods largely follow two directions. The first direction targets client-level removal. FedEraser approximates client removal by calibrating stored historical updates rather than retraining the federated model from scratch[7]. Rapid-retraining methods further reduce the cost of honoring the right to be forgotten by retraining only the affected part of the learning process[8], while system-oriented formulations treat unlearning as a client right that must be supported by the federated protocol itself[9]. These studies make client removal more practical, but they still leave open how strongly the model can be updated before retained utility deteriorates.</w:t>
-      </w:r>
-    </w:p>
-    <w:p>
-      <w:r>
-        <w:t>The second direction studies finer forgetting granularity. Class-discriminative pruning removes class-specific influence by pruning parameters associated with the target class[10]. Active-forgetting approaches further use teacher-student memory generation to support class-wise federated unlearning without relying entirely on direct access to forgotten data[11]. Together, these studies broaden federated unlearning from client deletion alone to a design space involving removal granularity, computational efficiency, and post-unlearning utility.</w:t>
+        <w:t>Federated unlearning extends machine unlearning to decentralized training, where a removal request must be handled without reconstructing the full centralized dataset. Recent survey work emphasizes that successful unlearning should be judged not only by whether target influence is weakened, but also by whether the remaining model still preserves acceptable utility</w:t>
+      </w:r>
+      <w:r>
+        <w:rPr>
+          <w:vertAlign w:val="superscript"/>
+        </w:rPr>
+        <w:t>[6]</w:t>
+      </w:r>
+      <w:r>
+        <w:t>.</w:t>
+      </w:r>
+    </w:p>
+    <w:p>
+      <w:r>
+        <w:t>Existing federated-unlearning methods largely follow two directions. The first direction targets client-level removal. FedEraser approximates client removal by calibrating stored historical updates rather than retraining the federated model from scratch</w:t>
+      </w:r>
+      <w:r>
+        <w:rPr>
+          <w:vertAlign w:val="superscript"/>
+        </w:rPr>
+        <w:t>[7]</w:t>
+      </w:r>
+      <w:r>
+        <w:t>. Rapid-retraining methods further reduce the cost of honoring the right to be forgotten by retraining only the affected part of the learning process</w:t>
+      </w:r>
+      <w:r>
+        <w:rPr>
+          <w:vertAlign w:val="superscript"/>
+        </w:rPr>
+        <w:t>[8]</w:t>
+      </w:r>
+      <w:r>
+        <w:t>, while system-oriented formulations treat unlearning as a client right that must be supported by the federated protocol itself</w:t>
+      </w:r>
+      <w:r>
+        <w:rPr>
+          <w:vertAlign w:val="superscript"/>
+        </w:rPr>
+        <w:t>[9]</w:t>
+      </w:r>
+      <w:r>
+        <w:t>. These studies make client removal more practical, but they still leave open how strongly the model can be updated before retained utility deteriorates.</w:t>
+      </w:r>
+    </w:p>
+    <w:p>
+      <w:r>
+        <w:t>The second direction studies finer forgetting granularity. Class-discriminative pruning removes class-specific influence by pruning parameters associated with the target class</w:t>
+      </w:r>
+      <w:r>
+        <w:rPr>
+          <w:vertAlign w:val="superscript"/>
+        </w:rPr>
+        <w:t>[10]</w:t>
+      </w:r>
+      <w:r>
+        <w:t>. Active-forgetting approaches further use teacher-student memory generation to support class-wise federated unlearning without relying entirely on direct access to forgotten data</w:t>
+      </w:r>
+      <w:r>
+        <w:rPr>
+          <w:vertAlign w:val="superscript"/>
+        </w:rPr>
+        <w:t>[11]</w:t>
+      </w:r>
+      <w:r>
+        <w:t>. Together, these studies broaden federated unlearning from client deletion alone to a design space involving removal granularity, computational efficiency, and post-unlearning utility.</w:t>
       </w:r>
     </w:p>
     <w:p>
@@ -209,12 +299,39 @@
     </w:p>
     <w:p>
       <w:r>
-        <w:t>Machine unlearning outside the federated setting provides a useful reference point. Early formulations defined unlearning as removing the influence of selected data without rebuilding the entire system from scratch[2], while SISA-style training reduced removal cost through structured retraining[12]. In federated settings, recent survey work organizes existing methods into retraining-based, update-correction, historical-update, knowledge-distillation, and second-order approximation families, and emphasizes that evaluation should jointly consider forgetting effectiveness and retained utility[13]. This tension directly motivates the present study.</w:t>
-      </w:r>
-    </w:p>
-    <w:p>
-      <w:r>
-        <w:t>A complementary line comes from second-order approximation. Influence functions show that data influence can be approximated through inverse-Hessian-vector products[3]. LiSSA-style stochastic second-order optimization offers a practical way to approximate such inverse-HVP directions without explicitly forming the Hessian[4]. Trust-region methods add a related optimization principle: parameter updates should be accepted only within a controlled region so that overly aggressive steps can be rejected[14]. Together, these ideas motivate curvature-informed unlearning updates that are evaluated not only by forgetting strength, but also by their effect on retained utility.</w:t>
+        <w:t>Machine unlearning outside the federated setting provides a useful reference point. Early formulations defined unlearning as removing the influence of selected data without rebuilding the entire system from scratch, while SISA-style training reduced removal cost through structured retraining</w:t>
+      </w:r>
+      <w:r>
+        <w:rPr>
+          <w:vertAlign w:val="superscript"/>
+        </w:rPr>
+        <w:t>[12]</w:t>
+      </w:r>
+      <w:r>
+        <w:t>. In federated settings, recent survey work organizes existing methods into retraining-based, update-correction, historical-update, knowledge-distillation, and second-order approximation families, and emphasizes that evaluation should jointly consider forgetting effectiveness and retained utility</w:t>
+      </w:r>
+      <w:r>
+        <w:rPr>
+          <w:vertAlign w:val="superscript"/>
+        </w:rPr>
+        <w:t>[13]</w:t>
+      </w:r>
+      <w:r>
+        <w:t>. This tension directly motivates the present study.</w:t>
+      </w:r>
+    </w:p>
+    <w:p>
+      <w:r>
+        <w:t>A complementary line comes from second-order approximation. Influence functions show that data influence can be approximated through inverse-Hessian-vector products. LiSSA-style stochastic second-order optimization offers a practical way to approximate such inverse-HVP directions without explicitly forming the Hessian. Trust-region methods add a related optimization principle: parameter updates should be accepted only within a controlled region so that overly aggressive steps can be rejected</w:t>
+      </w:r>
+      <w:r>
+        <w:rPr>
+          <w:vertAlign w:val="superscript"/>
+        </w:rPr>
+        <w:t>[14]</w:t>
+      </w:r>
+      <w:r>
+        <w:t>. Together, these ideas motivate curvature-informed unlearning updates that are evaluated not only by forgetting strength, but also by their effect on retained utility.</w:t>
       </w:r>
     </w:p>
     <w:p>
@@ -242,7 +359,7 @@
     </w:p>
     <w:tbl>
       <w:tblPr>
-        <w:tblStyle w:val="5"/>
+        <w:tblStyle w:val="7"/>
         <w:tblW w:w="0" w:type="auto"/>
         <w:tblInd w:w="0" w:type="dxa"/>
         <w:tblBorders>
@@ -262,13 +379,13 @@
         </w:tblCellMar>
       </w:tblPr>
       <w:tblGrid>
-        <w:gridCol w:w="1441"/>
-        <w:gridCol w:w="1246"/>
-        <w:gridCol w:w="1314"/>
-        <w:gridCol w:w="1348"/>
-        <w:gridCol w:w="1007"/>
-        <w:gridCol w:w="1101"/>
-        <w:gridCol w:w="1263"/>
+        <w:gridCol w:w="1364"/>
+        <w:gridCol w:w="1342"/>
+        <w:gridCol w:w="999"/>
+        <w:gridCol w:w="1235"/>
+        <w:gridCol w:w="1213"/>
+        <w:gridCol w:w="1332"/>
+        <w:gridCol w:w="1235"/>
       </w:tblGrid>
       <w:tr>
         <w:tblPrEx>
@@ -940,7 +1057,7 @@
     </w:p>
     <w:p>
       <w:r>
-        <w:t>The federated training phase follows the FedHDS fine-tuning backbone introduced by Qin et al.[5]. FedHDS is treated as a fixed training backbone rather than as a contribution of this paper: it provides the shared pre-unlearning model θ*, and the proposed method operates only after training has completed. FL and FedHDS therefore act as training references, whereas forget-batch and retained-set Hessians are compared as post-training unlearning updates from the same starting point.</w:t>
+        <w:t>The federated training phase follows the FedHDS fine-tuning backbone introduced by Qin et al. FedHDS is treated as a fixed training backbone rather than as a contribution of this paper: it provides the shared pre-unlearning model θ*, and the proposed method operates only after training has completed. FL and FedHDS therefore act as training references, whereas forget-batch and retained-set Hessians are compared as post-training unlearning updates from the same starting point.</w:t>
       </w:r>
     </w:p>
     <w:p>
@@ -1499,8 +1616,37 @@
     </w:p>
     <w:p>
       <w:r>
-        <w:t>We use Dolly as the federated instruction-tuning dataset[15]. Qwen2-0.5B[16] is used for the feasibility validation, main trade-off comparison, and direction ablation because it is large enough to represent a language-model fine-tuning setting while still supporting repeated Hessian-vector product experiments under the available single-device compute budget. Qwen2.5-1.5B[17] is additionally used in the model-scale generalization study.</w:t>
-      </w:r>
+        <w:t>We use Dolly as the federated instruction-tuning dataset</w:t>
+      </w:r>
+      <w:r>
+        <w:rPr>
+          <w:vertAlign w:val="superscript"/>
+        </w:rPr>
+        <w:t>[15]</w:t>
+      </w:r>
+      <w:r>
+        <w:t>. Qwen2-0.5B</w:t>
+      </w:r>
+      <w:r>
+        <w:rPr>
+          <w:vertAlign w:val="superscript"/>
+        </w:rPr>
+        <w:t>[16]</w:t>
+      </w:r>
+      <w:r>
+        <w:t xml:space="preserve"> is used for the feasibility validation, main trade-off comparison, and direction ablation because it is large enough to represent a language-model fine-tuning setting while still supporting repeated Hessian-vector product experiments under the available single-device compute budget. Qwen2.5-1.5B</w:t>
+      </w:r>
+      <w:r>
+        <w:rPr>
+          <w:vertAlign w:val="superscript"/>
+        </w:rPr>
+        <w:t>[17]</w:t>
+      </w:r>
+      <w:r>
+        <w:t xml:space="preserve"> is additionally used in the model-scale generalization study.</w:t>
+      </w:r>
+      <w:bookmarkStart w:id="0" w:name="_GoBack"/>
+      <w:bookmarkEnd w:id="0"/>
     </w:p>
     <w:p>
       <w:r>
@@ -1542,7 +1688,7 @@
     </w:p>
     <w:p>
       <w:r>
-        <w:t>Finally, the seed-robustness group repeats the large-model/large-data configuration with seeds 43 and 44. It identifies which conclusions are stable across seeds and which remain sensitive to the local training trajectory.</w:t>
+        <w:t>Finally, the seed-robustness group repeats the main trade-off configuration across seeds 42, 43, 44, 45, 47 under Dirichlet alpha=0.5. One additional run, seed46, diverged during baseline training by round 2 (round2_global_loss = 10.0 for FL, FedHDS, and retrain_oracle), so it is archived as an anomalous appendix case rather than pooled with valid method comparisons. The replacement run seed47 restores the five-seed bundle and lets us separate method instability from training-time divergence.</w:t>
       </w:r>
     </w:p>
     <w:p>
@@ -1555,12 +1701,12 @@
     </w:p>
     <w:p>
       <w:r>
-        <w:t>This study compares five settings: FL, the FedHDS baseline, FedHDS followed by forget-batch Hessian unlearning, FedHDS followed by retained-set Hessian with global-loss guard, and FedHDS followed by retained-set Hessian with negative-direction correction and forget-loss guard. Together, these settings isolate baseline training quality, the effect of the curvature reference, and the impact of sign correction under the same forgetting signal.</w:t>
-      </w:r>
-    </w:p>
-    <w:p>
-      <w:r>
-        <w:t>The forget-batch Hessian setting serves as the direct unlearning baseline because it uses the forget-client batch as both the gradient source and the Hessian reference. By contrast, the retained-set Hessian setting keeps the same forget-client gradient but replaces the Hessian reference with retained-client data, thereby isolating the curvature effect. The negative-direction update is introduced only after direction probing shows that the default sign can be misaligned with the forgetting objective.</w:t>
+        <w:t>This study compares seven settings: FL, the FedHDS baseline, retrain_oracle, forget_batch_hessian, retained_negative_guard, ga, and ga_guarded. Together, these settings isolate baseline training quality, exact client exclusion, the effect of the curvature reference, and the roles of sign correction and guard control under the same forgetting signal.</w:t>
+      </w:r>
+    </w:p>
+    <w:p>
+      <w:r>
+        <w:t>The forget-batch Hessian setting serves as the direct second-order unlearning baseline because it uses the forget-client batch as both the gradient source and the Hessian reference. By contrast, retained_negative_guard keeps the same forget-client gradient but replaces the Hessian reference with retained-client data, applies negative-direction correction, and validates the update through global-loss and forget-loss guards. GA and GA-guarded act as first-order controls with and without stepped guard enforcement. retrain_oracle is kept as an exact client-exclusion reference rather than as a practical deployment method.</w:t>
       </w:r>
     </w:p>
     <w:p>
@@ -1578,7 +1724,7 @@
     </w:p>
     <w:p>
       <w:r>
-        <w:t>For the direction-and-guard ablation, interpretation focuses on the interaction among update sign, forget-loss guard, forget-client loss change, and global-loss guard behavior rather than on another FL-versus-baseline comparison. The scale study then evaluates the same retained-set negative-direction update under larger model and data settings, while the seed-robustness study separates conclusions that remain stable across seeds from those that are sensitive to the local training trajectory.</w:t>
+        <w:t>For the direction-and-guard ablation, interpretation focuses on the interaction among update sign, forget-loss guard, forget-client loss change, and global-loss guard behavior rather than on another FL-versus-baseline comparison. The scale study then evaluates the same retained-set negative-direction update under larger model and data settings, while the seed-robustness study separates conclusions that remain stable across seeds from those that are sensitive to the local training trajectory. We still report the current loss-based MIA values, but only as supplementary indicators; in this setup they are too weak to serve as the primary acceptance criterion for method selection.</w:t>
       </w:r>
     </w:p>
     <w:p>
@@ -1614,7 +1760,7 @@
     </w:p>
     <w:tbl>
       <w:tblPr>
-        <w:tblStyle w:val="5"/>
+        <w:tblStyle w:val="7"/>
         <w:tblW w:w="0" w:type="auto"/>
         <w:tblInd w:w="0" w:type="dxa"/>
         <w:tblBorders>
@@ -1634,14 +1780,14 @@
         </w:tblCellMar>
       </w:tblPr>
       <w:tblGrid>
-        <w:gridCol w:w="1410"/>
-        <w:gridCol w:w="1028"/>
-        <w:gridCol w:w="1372"/>
-        <w:gridCol w:w="1013"/>
-        <w:gridCol w:w="1013"/>
-        <w:gridCol w:w="1037"/>
-        <w:gridCol w:w="917"/>
-        <w:gridCol w:w="930"/>
+        <w:gridCol w:w="1269"/>
+        <w:gridCol w:w="1081"/>
+        <w:gridCol w:w="1209"/>
+        <w:gridCol w:w="1066"/>
+        <w:gridCol w:w="1066"/>
+        <w:gridCol w:w="1091"/>
+        <w:gridCol w:w="962"/>
+        <w:gridCol w:w="976"/>
       </w:tblGrid>
       <w:tr>
         <w:tblPrEx>
@@ -2149,17 +2295,17 @@
     </w:p>
     <w:p>
       <w:r>
-        <w:t>The main trade-off setting increases the data sampling ratio from 0.2 to 0.4 and the number of training rounds from 10 to 20, and serves as the primary testbed for the utility-forgetting trade-off.</w:t>
-      </w:r>
-    </w:p>
-    <w:p>
-      <w:r>
-        <w:t>Table 3. Main utility-forgetting trade-off results with retrain reference.</w:t>
+        <w:t>The main trade-off setting increases the data sampling ratio from 0.2 to 0.4 and the number of training rounds from 10 to 20, and serves as the primary testbed for the utility-forgetting trade-off. The key quantitative claims in this section are based on the five valid seeds 42, 43, 44, 45, 47 under Dirichlet alpha=0.5.</w:t>
+      </w:r>
+    </w:p>
+    <w:p>
+      <w:r>
+        <w:t>Table 3. Five-seed aggregate utility-forgetting results under the main Dirichlet alpha=0.5 setting.</w:t>
       </w:r>
     </w:p>
     <w:tbl>
       <w:tblPr>
-        <w:tblStyle w:val="5"/>
+        <w:tblStyle w:val="7"/>
         <w:tblW w:w="0" w:type="auto"/>
         <w:tblInd w:w="0" w:type="dxa"/>
         <w:tblBorders>
@@ -2179,14 +2325,14 @@
         </w:tblCellMar>
       </w:tblPr>
       <w:tblGrid>
-        <w:gridCol w:w="1293"/>
-        <w:gridCol w:w="990"/>
-        <w:gridCol w:w="1738"/>
-        <w:gridCol w:w="1024"/>
-        <w:gridCol w:w="935"/>
-        <w:gridCol w:w="957"/>
-        <w:gridCol w:w="848"/>
-        <w:gridCol w:w="935"/>
+        <w:gridCol w:w="1179"/>
+        <w:gridCol w:w="1087"/>
+        <w:gridCol w:w="1072"/>
+        <w:gridCol w:w="1087"/>
+        <w:gridCol w:w="994"/>
+        <w:gridCol w:w="999"/>
+        <w:gridCol w:w="994"/>
+        <w:gridCol w:w="1308"/>
       </w:tblGrid>
       <w:tr>
         <w:tblPrEx>
@@ -2211,77 +2357,77 @@
           </w:tcPr>
           <w:p>
             <w:r>
-              <w:t>Source</w:t>
-            </w:r>
-          </w:p>
-        </w:tc>
-        <w:tc>
-          <w:tcPr>
-            <w:tcW w:w="0" w:type="auto"/>
-          </w:tcPr>
-          <w:p>
-            <w:r>
-              <w:t>Setting</w:t>
-            </w:r>
-          </w:p>
-        </w:tc>
-        <w:tc>
-          <w:tcPr>
-            <w:tcW w:w="0" w:type="auto"/>
-          </w:tcPr>
-          <w:p>
-            <w:r>
-              <w:t>Hessian</w:t>
-            </w:r>
-          </w:p>
-        </w:tc>
-        <w:tc>
-          <w:tcPr>
-            <w:tcW w:w="0" w:type="auto"/>
-          </w:tcPr>
-          <w:p>
-            <w:r>
-              <w:t>Forget loss</w:t>
-            </w:r>
-          </w:p>
-        </w:tc>
-        <w:tc>
-          <w:tcPr>
-            <w:tcW w:w="0" w:type="auto"/>
-          </w:tcPr>
-          <w:p>
-            <w:r>
-              <w:t>Final global loss</w:t>
-            </w:r>
-          </w:p>
-        </w:tc>
-        <w:tc>
-          <w:tcPr>
-            <w:tcW w:w="0" w:type="auto"/>
-          </w:tcPr>
-          <w:p>
-            <w:r>
-              <w:t>Update L2</w:t>
-            </w:r>
-          </w:p>
-        </w:tc>
-        <w:tc>
-          <w:tcPr>
-            <w:tcW w:w="0" w:type="auto"/>
-          </w:tcPr>
-          <w:p>
-            <w:r>
-              <w:t>Steps</w:t>
-            </w:r>
-          </w:p>
-        </w:tc>
-        <w:tc>
-          <w:tcPr>
-            <w:tcW w:w="0" w:type="auto"/>
-          </w:tcPr>
-          <w:p>
-            <w:r>
-              <w:t>Time (s)</w:t>
+              <w:t>Method</w:t>
+            </w:r>
+          </w:p>
+        </w:tc>
+        <w:tc>
+          <w:tcPr>
+            <w:tcW w:w="0" w:type="auto"/>
+          </w:tcPr>
+          <w:p>
+            <w:r>
+              <w:t>Mean Deltaforget</w:t>
+            </w:r>
+          </w:p>
+        </w:tc>
+        <w:tc>
+          <w:tcPr>
+            <w:tcW w:w="0" w:type="auto"/>
+          </w:tcPr>
+          <w:p>
+            <w:r>
+              <w:t>Positive seeds</w:t>
+            </w:r>
+          </w:p>
+        </w:tc>
+        <w:tc>
+          <w:tcPr>
+            <w:tcW w:w="0" w:type="auto"/>
+          </w:tcPr>
+          <w:p>
+            <w:r>
+              <w:t>Mean Deltaglobal vs FedHDS</w:t>
+            </w:r>
+          </w:p>
+        </w:tc>
+        <w:tc>
+          <w:tcPr>
+            <w:tcW w:w="0" w:type="auto"/>
+          </w:tcPr>
+          <w:p>
+            <w:r>
+              <w:t>Mean update L2</w:t>
+            </w:r>
+          </w:p>
+        </w:tc>
+        <w:tc>
+          <w:tcPr>
+            <w:tcW w:w="0" w:type="auto"/>
+          </w:tcPr>
+          <w:p>
+            <w:r>
+              <w:t>Mean accepted steps</w:t>
+            </w:r>
+          </w:p>
+        </w:tc>
+        <w:tc>
+          <w:tcPr>
+            <w:tcW w:w="0" w:type="auto"/>
+          </w:tcPr>
+          <w:p>
+            <w:r>
+              <w:t>Mean runtime (s)</w:t>
+            </w:r>
+          </w:p>
+        </w:tc>
+        <w:tc>
+          <w:tcPr>
+            <w:tcW w:w="0" w:type="auto"/>
+          </w:tcPr>
+          <w:p>
+            <w:r>
+              <w:t>Main reading</w:t>
             </w:r>
           </w:p>
         </w:tc>
@@ -2319,26 +2465,6 @@
           </w:tcPr>
           <w:p>
             <w:r>
-              <w:t>step size 1.0000</w:t>
-            </w:r>
-          </w:p>
-        </w:tc>
-        <w:tc>
-          <w:tcPr>
-            <w:tcW w:w="0" w:type="auto"/>
-          </w:tcPr>
-          <w:p>
-            <w:r>
-              <w:t>none</w:t>
-            </w:r>
-          </w:p>
-        </w:tc>
-        <w:tc>
-          <w:tcPr>
-            <w:tcW w:w="0" w:type="auto"/>
-          </w:tcPr>
-          <w:p>
-            <w:r>
               <w:t>N/A</w:t>
             </w:r>
           </w:p>
@@ -2349,16 +2475,6 @@
           </w:tcPr>
           <w:p>
             <w:r>
-              <w:t>1.5250</w:t>
-            </w:r>
-          </w:p>
-        </w:tc>
-        <w:tc>
-          <w:tcPr>
-            <w:tcW w:w="0" w:type="auto"/>
-          </w:tcPr>
-          <w:p>
-            <w:r>
               <w:t>N/A</w:t>
             </w:r>
           </w:p>
@@ -2369,6 +2485,16 @@
           </w:tcPr>
           <w:p>
             <w:r>
+              <w:t>+0.0000</w:t>
+            </w:r>
+          </w:p>
+        </w:tc>
+        <w:tc>
+          <w:tcPr>
+            <w:tcW w:w="0" w:type="auto"/>
+          </w:tcPr>
+          <w:p>
+            <w:r>
               <w:t>N/A</w:t>
             </w:r>
           </w:p>
@@ -2380,6 +2506,26 @@
           <w:p>
             <w:r>
               <w:t>N/A</w:t>
+            </w:r>
+          </w:p>
+        </w:tc>
+        <w:tc>
+          <w:tcPr>
+            <w:tcW w:w="0" w:type="auto"/>
+          </w:tcPr>
+          <w:p>
+            <w:r>
+              <w:t>N/A</w:t>
+            </w:r>
+          </w:p>
+        </w:tc>
+        <w:tc>
+          <w:tcPr>
+            <w:tcW w:w="0" w:type="auto"/>
+          </w:tcPr>
+          <w:p>
+            <w:r>
+              <w:t>reference checkpoint</w:t>
             </w:r>
           </w:p>
         </w:tc>
@@ -2417,26 +2563,6 @@
           </w:tcPr>
           <w:p>
             <w:r>
-              <w:t>step size 1.0000</w:t>
-            </w:r>
-          </w:p>
-        </w:tc>
-        <w:tc>
-          <w:tcPr>
-            <w:tcW w:w="0" w:type="auto"/>
-          </w:tcPr>
-          <w:p>
-            <w:r>
-              <w:t>none</w:t>
-            </w:r>
-          </w:p>
-        </w:tc>
-        <w:tc>
-          <w:tcPr>
-            <w:tcW w:w="0" w:type="auto"/>
-          </w:tcPr>
-          <w:p>
-            <w:r>
               <w:t>N/A</w:t>
             </w:r>
           </w:p>
@@ -2447,16 +2573,6 @@
           </w:tcPr>
           <w:p>
             <w:r>
-              <w:t>1.5441</w:t>
-            </w:r>
-          </w:p>
-        </w:tc>
-        <w:tc>
-          <w:tcPr>
-            <w:tcW w:w="0" w:type="auto"/>
-          </w:tcPr>
-          <w:p>
-            <w:r>
               <w:t>N/A</w:t>
             </w:r>
           </w:p>
@@ -2467,6 +2583,16 @@
           </w:tcPr>
           <w:p>
             <w:r>
+              <w:t>-0.0171</w:t>
+            </w:r>
+          </w:p>
+        </w:tc>
+        <w:tc>
+          <w:tcPr>
+            <w:tcW w:w="0" w:type="auto"/>
+          </w:tcPr>
+          <w:p>
+            <w:r>
               <w:t>N/A</w:t>
             </w:r>
           </w:p>
@@ -2478,6 +2604,26 @@
           <w:p>
             <w:r>
               <w:t>N/A</w:t>
+            </w:r>
+          </w:p>
+        </w:tc>
+        <w:tc>
+          <w:tcPr>
+            <w:tcW w:w="0" w:type="auto"/>
+          </w:tcPr>
+          <w:p>
+            <w:r>
+              <w:t>N/A</w:t>
+            </w:r>
+          </w:p>
+        </w:tc>
+        <w:tc>
+          <w:tcPr>
+            <w:tcW w:w="0" w:type="auto"/>
+          </w:tcPr>
+          <w:p>
+            <w:r>
+              <w:t>comparable training baseline</w:t>
             </w:r>
           </w:p>
         </w:tc>
@@ -2515,37 +2661,27 @@
           </w:tcPr>
           <w:p>
             <w:r>
-              <w:t>exclude client 0, learning rate 5e-5</w:t>
-            </w:r>
-          </w:p>
-        </w:tc>
-        <w:tc>
-          <w:tcPr>
-            <w:tcW w:w="0" w:type="auto"/>
-          </w:tcPr>
-          <w:p>
-            <w:r>
-              <w:t>retrain-from-scratch</w:t>
-            </w:r>
-          </w:p>
-        </w:tc>
-        <w:tc>
-          <w:tcPr>
-            <w:tcW w:w="0" w:type="auto"/>
-          </w:tcPr>
-          <w:p>
-            <w:r>
-              <w:t>held-out client-0 loss = 2.2168</w:t>
-            </w:r>
-          </w:p>
-        </w:tc>
-        <w:tc>
-          <w:tcPr>
-            <w:tcW w:w="0" w:type="auto"/>
-          </w:tcPr>
-          <w:p>
-            <w:r>
-              <w:t>1.5355</w:t>
+              <w:t>+0.0000</w:t>
+            </w:r>
+          </w:p>
+        </w:tc>
+        <w:tc>
+          <w:tcPr>
+            <w:tcW w:w="0" w:type="auto"/>
+          </w:tcPr>
+          <w:p>
+            <w:r>
+              <w:t>0/5</w:t>
+            </w:r>
+          </w:p>
+        </w:tc>
+        <w:tc>
+          <w:tcPr>
+            <w:tcW w:w="0" w:type="auto"/>
+          </w:tcPr>
+          <w:p>
+            <w:r>
+              <w:t>+0.0012</w:t>
             </w:r>
           </w:p>
         </w:tc>
@@ -2565,17 +2701,27 @@
           </w:tcPr>
           <w:p>
             <w:r>
-              <w:t>N/A</w:t>
-            </w:r>
-          </w:p>
-        </w:tc>
-        <w:tc>
-          <w:tcPr>
-            <w:tcW w:w="0" w:type="auto"/>
-          </w:tcPr>
-          <w:p>
-            <w:r>
-              <w:t>N/A</w:t>
+              <w:t>0/0</w:t>
+            </w:r>
+          </w:p>
+        </w:tc>
+        <w:tc>
+          <w:tcPr>
+            <w:tcW w:w="0" w:type="auto"/>
+          </w:tcPr>
+          <w:p>
+            <w:r>
+              <w:t>0.00</w:t>
+            </w:r>
+          </w:p>
+        </w:tc>
+        <w:tc>
+          <w:tcPr>
+            <w:tcW w:w="0" w:type="auto"/>
+          </w:tcPr>
+          <w:p>
+            <w:r>
+              <w:t>exact exclusion reference, not stronger forgetting</w:t>
             </w:r>
           </w:p>
         </w:tc>
@@ -2613,47 +2759,37 @@
           </w:tcPr>
           <w:p>
             <w:r>
-              <w:t>step size 0.0100</w:t>
-            </w:r>
-          </w:p>
-        </w:tc>
-        <w:tc>
-          <w:tcPr>
-            <w:tcW w:w="0" w:type="auto"/>
-          </w:tcPr>
-          <w:p>
-            <w:r>
-              <w:t>forget-batch</w:t>
-            </w:r>
-          </w:p>
-        </w:tc>
-        <w:tc>
-          <w:tcPr>
-            <w:tcW w:w="0" w:type="auto"/>
-          </w:tcPr>
-          <w:p>
-            <w:r>
-              <w:t>2.2581 -&gt; 2.2866</w:t>
-            </w:r>
-          </w:p>
-        </w:tc>
-        <w:tc>
-          <w:tcPr>
-            <w:tcW w:w="0" w:type="auto"/>
-          </w:tcPr>
-          <w:p>
-            <w:r>
-              <w:t>1.6257</w:t>
-            </w:r>
-          </w:p>
-        </w:tc>
-        <w:tc>
-          <w:tcPr>
-            <w:tcW w:w="0" w:type="auto"/>
-          </w:tcPr>
-          <w:p>
-            <w:r>
-              <w:t>0.5077</w:t>
+              <w:t>+3.6769</w:t>
+            </w:r>
+          </w:p>
+        </w:tc>
+        <w:tc>
+          <w:tcPr>
+            <w:tcW w:w="0" w:type="auto"/>
+          </w:tcPr>
+          <w:p>
+            <w:r>
+              <w:t>4/5</w:t>
+            </w:r>
+          </w:p>
+        </w:tc>
+        <w:tc>
+          <w:tcPr>
+            <w:tcW w:w="0" w:type="auto"/>
+          </w:tcPr>
+          <w:p>
+            <w:r>
+              <w:t>+3.7339</w:t>
+            </w:r>
+          </w:p>
+        </w:tc>
+        <w:tc>
+          <w:tcPr>
+            <w:tcW w:w="0" w:type="auto"/>
+          </w:tcPr>
+          <w:p>
+            <w:r>
+              <w:t>2.4336</w:t>
             </w:r>
           </w:p>
         </w:tc>
@@ -2673,7 +2809,17 @@
           </w:tcPr>
           <w:p>
             <w:r>
-              <w:t>1.64</w:t>
+              <w:t>1.72</w:t>
+            </w:r>
+          </w:p>
+        </w:tc>
+        <w:tc>
+          <w:tcPr>
+            <w:tcW w:w="0" w:type="auto"/>
+          </w:tcPr>
+          <w:p>
+            <w:r>
+              <w:t>strongest forgetting, unstable utility</w:t>
             </w:r>
           </w:p>
         </w:tc>
@@ -2701,57 +2847,17 @@
           </w:tcPr>
           <w:p>
             <w:r>
-              <w:t>Retained-set guarded update</w:t>
-            </w:r>
-          </w:p>
-        </w:tc>
-        <w:tc>
-          <w:tcPr>
-            <w:tcW w:w="0" w:type="auto"/>
-          </w:tcPr>
-          <w:p>
-            <w:r>
-              <w:t>step size 0.0100, maximum norm 0.300, 5 substeps, global-loss guard 1.575</w:t>
-            </w:r>
-          </w:p>
-        </w:tc>
-        <w:tc>
-          <w:tcPr>
-            <w:tcW w:w="0" w:type="auto"/>
-          </w:tcPr>
-          <w:p>
-            <w:r>
-              <w:t>retained-set</w:t>
-            </w:r>
-          </w:p>
-        </w:tc>
-        <w:tc>
-          <w:tcPr>
-            <w:tcW w:w="0" w:type="auto"/>
-          </w:tcPr>
-          <w:p>
-            <w:r>
-              <w:t>2.2581 -&gt; 2.2329</w:t>
-            </w:r>
-          </w:p>
-        </w:tc>
-        <w:tc>
-          <w:tcPr>
-            <w:tcW w:w="0" w:type="auto"/>
-          </w:tcPr>
-          <w:p>
-            <w:r>
-              <w:t>1.5482</w:t>
-            </w:r>
-          </w:p>
-        </w:tc>
-        <w:tc>
-          <w:tcPr>
-            <w:tcW w:w="0" w:type="auto"/>
-          </w:tcPr>
-          <w:p>
-            <w:r>
-              <w:t>0.2486</w:t>
+              <w:t>Retained-set negative guard</w:t>
+            </w:r>
+          </w:p>
+        </w:tc>
+        <w:tc>
+          <w:tcPr>
+            <w:tcW w:w="0" w:type="auto"/>
+          </w:tcPr>
+          <w:p>
+            <w:r>
+              <w:t>+0.4011</w:t>
             </w:r>
           </w:p>
         </w:tc>
@@ -2771,7 +2877,243 @@
           </w:tcPr>
           <w:p>
             <w:r>
-              <w:t>131.13</w:t>
+              <w:t>+0.0618</w:t>
+            </w:r>
+          </w:p>
+        </w:tc>
+        <w:tc>
+          <w:tcPr>
+            <w:tcW w:w="0" w:type="auto"/>
+          </w:tcPr>
+          <w:p>
+            <w:r>
+              <w:t>0.0636</w:t>
+            </w:r>
+          </w:p>
+        </w:tc>
+        <w:tc>
+          <w:tcPr>
+            <w:tcW w:w="0" w:type="auto"/>
+          </w:tcPr>
+          <w:p>
+            <w:r>
+              <w:t>3.2/4.0</w:t>
+            </w:r>
+          </w:p>
+        </w:tc>
+        <w:tc>
+          <w:tcPr>
+            <w:tcW w:w="0" w:type="auto"/>
+          </w:tcPr>
+          <w:p>
+            <w:r>
+              <w:t>112.30</w:t>
+            </w:r>
+          </w:p>
+        </w:tc>
+        <w:tc>
+          <w:tcPr>
+            <w:tcW w:w="0" w:type="auto"/>
+          </w:tcPr>
+          <w:p>
+            <w:r>
+              <w:t>main utility-preserving trade-off</w:t>
+            </w:r>
+          </w:p>
+        </w:tc>
+      </w:tr>
+      <w:tr>
+        <w:tblPrEx>
+          <w:tblBorders>
+            <w:top w:val="single" w:color="auto" w:sz="8" w:space="0"/>
+            <w:left w:val="single" w:color="auto" w:sz="8" w:space="0"/>
+            <w:bottom w:val="single" w:color="auto" w:sz="8" w:space="0"/>
+            <w:right w:val="single" w:color="auto" w:sz="8" w:space="0"/>
+            <w:insideH w:val="single" w:color="auto" w:sz="8" w:space="0"/>
+            <w:insideV w:val="single" w:color="auto" w:sz="8" w:space="0"/>
+          </w:tblBorders>
+          <w:tblCellMar>
+            <w:top w:w="0" w:type="dxa"/>
+            <w:left w:w="108" w:type="dxa"/>
+            <w:bottom w:w="0" w:type="dxa"/>
+            <w:right w:w="108" w:type="dxa"/>
+          </w:tblCellMar>
+        </w:tblPrEx>
+        <w:tc>
+          <w:tcPr>
+            <w:tcW w:w="0" w:type="auto"/>
+          </w:tcPr>
+          <w:p>
+            <w:r>
+              <w:t>GA</w:t>
+            </w:r>
+          </w:p>
+        </w:tc>
+        <w:tc>
+          <w:tcPr>
+            <w:tcW w:w="0" w:type="auto"/>
+          </w:tcPr>
+          <w:p>
+            <w:r>
+              <w:t>+0.0096</w:t>
+            </w:r>
+          </w:p>
+        </w:tc>
+        <w:tc>
+          <w:tcPr>
+            <w:tcW w:w="0" w:type="auto"/>
+          </w:tcPr>
+          <w:p>
+            <w:r>
+              <w:t>5/5</w:t>
+            </w:r>
+          </w:p>
+        </w:tc>
+        <w:tc>
+          <w:tcPr>
+            <w:tcW w:w="0" w:type="auto"/>
+          </w:tcPr>
+          <w:p>
+            <w:r>
+              <w:t>+0.0016</w:t>
+            </w:r>
+          </w:p>
+        </w:tc>
+        <w:tc>
+          <w:tcPr>
+            <w:tcW w:w="0" w:type="auto"/>
+          </w:tcPr>
+          <w:p>
+            <w:r>
+              <w:t>0.0055</w:t>
+            </w:r>
+          </w:p>
+        </w:tc>
+        <w:tc>
+          <w:tcPr>
+            <w:tcW w:w="0" w:type="auto"/>
+          </w:tcPr>
+          <w:p>
+            <w:r>
+              <w:t>1/1</w:t>
+            </w:r>
+          </w:p>
+        </w:tc>
+        <w:tc>
+          <w:tcPr>
+            <w:tcW w:w="0" w:type="auto"/>
+          </w:tcPr>
+          <w:p>
+            <w:r>
+              <w:t>1.26</w:t>
+            </w:r>
+          </w:p>
+        </w:tc>
+        <w:tc>
+          <w:tcPr>
+            <w:tcW w:w="0" w:type="auto"/>
+          </w:tcPr>
+          <w:p>
+            <w:r>
+              <w:t>stable but weak forgetting</w:t>
+            </w:r>
+          </w:p>
+        </w:tc>
+      </w:tr>
+      <w:tr>
+        <w:tblPrEx>
+          <w:tblBorders>
+            <w:top w:val="single" w:color="auto" w:sz="8" w:space="0"/>
+            <w:left w:val="single" w:color="auto" w:sz="8" w:space="0"/>
+            <w:bottom w:val="single" w:color="auto" w:sz="8" w:space="0"/>
+            <w:right w:val="single" w:color="auto" w:sz="8" w:space="0"/>
+            <w:insideH w:val="single" w:color="auto" w:sz="8" w:space="0"/>
+            <w:insideV w:val="single" w:color="auto" w:sz="8" w:space="0"/>
+          </w:tblBorders>
+          <w:tblCellMar>
+            <w:top w:w="0" w:type="dxa"/>
+            <w:left w:w="108" w:type="dxa"/>
+            <w:bottom w:w="0" w:type="dxa"/>
+            <w:right w:w="108" w:type="dxa"/>
+          </w:tblCellMar>
+        </w:tblPrEx>
+        <w:tc>
+          <w:tcPr>
+            <w:tcW w:w="0" w:type="auto"/>
+          </w:tcPr>
+          <w:p>
+            <w:r>
+              <w:t>GA guarded</w:t>
+            </w:r>
+          </w:p>
+        </w:tc>
+        <w:tc>
+          <w:tcPr>
+            <w:tcW w:w="0" w:type="auto"/>
+          </w:tcPr>
+          <w:p>
+            <w:r>
+              <w:t>+0.0097</w:t>
+            </w:r>
+          </w:p>
+        </w:tc>
+        <w:tc>
+          <w:tcPr>
+            <w:tcW w:w="0" w:type="auto"/>
+          </w:tcPr>
+          <w:p>
+            <w:r>
+              <w:t>5/5</w:t>
+            </w:r>
+          </w:p>
+        </w:tc>
+        <w:tc>
+          <w:tcPr>
+            <w:tcW w:w="0" w:type="auto"/>
+          </w:tcPr>
+          <w:p>
+            <w:r>
+              <w:t>-0.0011</w:t>
+            </w:r>
+          </w:p>
+        </w:tc>
+        <w:tc>
+          <w:tcPr>
+            <w:tcW w:w="0" w:type="auto"/>
+          </w:tcPr>
+          <w:p>
+            <w:r>
+              <w:t>0.0055</w:t>
+            </w:r>
+          </w:p>
+        </w:tc>
+        <w:tc>
+          <w:tcPr>
+            <w:tcW w:w="0" w:type="auto"/>
+          </w:tcPr>
+          <w:p>
+            <w:r>
+              <w:t>5/5</w:t>
+            </w:r>
+          </w:p>
+        </w:tc>
+        <w:tc>
+          <w:tcPr>
+            <w:tcW w:w="0" w:type="auto"/>
+          </w:tcPr>
+          <w:p>
+            <w:r>
+              <w:t>125.45</w:t>
+            </w:r>
+          </w:p>
+        </w:tc>
+        <w:tc>
+          <w:tcPr>
+            <w:tcW w:w="0" w:type="auto"/>
+          </w:tcPr>
+          <w:p>
+            <w:r>
+              <w:t>most utility-stable, forgetting still weak</w:t>
             </w:r>
           </w:p>
         </w:tc>
@@ -2783,38 +3125,170 @@
       </w:r>
     </w:p>
     <w:p>
-      <w:r>
-        <w:t>Figure 1. FL vs FedHDS training convergence (data sampling ratio 0.4, 20 rounds). FedHDS converges to a lower final global loss (1.5250) than FL (1.5441), making it the stronger utility baseline for subsequent unlearning experiments.</w:t>
-      </w:r>
-    </w:p>
-    <w:p>
-      <w:r>
-        <w:t>Under this stronger training configuration, FedHDS achieves final global loss 1.5250, below FL's 1.5441, and is therefore used as the utility baseline for the unlearning experiments. The retrain-from-scratch reference reaches global loss 1.5355 and held-out client-0 loss 2.2168, showing that exact client exclusion on this IID split does not necessarily produce a higher held-out forget-client loss.</w:t>
-      </w:r>
-    </w:p>
-    <w:p>
-      <w:r>
-        <w:t>Figure 2. Final global loss comparison in the main trade-off experiment.</w:t>
-      </w:r>
-    </w:p>
-    <w:p>
-      <w:r>
-        <w:t>The main result of Table 3 is the curvature-reference trade-off. Forget-batch Hessian increases forget-client loss from 2.2581 to 2.2866 (+0.0285), but raises global loss from 1.5250 to 1.6257 (+0.1007). Its update norm (0.5077) is also much larger than that of the retained-set guarded update.</w:t>
-      </w:r>
-    </w:p>
-    <w:p>
-      <w:r>
-        <w:t>Figure 3 shows the same trade-off from the forget-client side: the retained-set guarded update moves in the opposite direction.</w:t>
-      </w:r>
-    </w:p>
-    <w:p>
-      <w:r>
-        <w:t>Figure 3. Forget-client loss before and after unlearning in the main trade-off experiment.</w:t>
-      </w:r>
-    </w:p>
-    <w:p>
-      <w:r>
-        <w:t>By contrast, the retained-set guarded update keeps global loss close to the FedHDS baseline (1.5482, only +0.0232) with all 5/5 steps accepted, but decreases forget-client loss to 2.2329 (-0.0252). The main conclusion is therefore not a simple win: forget-batch is aligned with forgetting but utility-costly, whereas retained-set is utility-preserving but direction-misaligned. Section 5.3 focuses on that sign problem.</w:t>
+      <w:pPr>
+        <w:jc w:val="center"/>
+      </w:pPr>
+      <w:r>
+        <w:drawing>
+          <wp:inline distT="0" distB="0" distL="114300" distR="114300">
+            <wp:extent cx="5219700" cy="3261995"/>
+            <wp:effectExtent l="0" t="0" r="0" b="1905"/>
+            <wp:docPr id="133" name="Picture 133"/>
+            <wp:cNvGraphicFramePr>
+              <a:graphicFrameLocks xmlns:a="http://schemas.openxmlformats.org/drawingml/2006/main" noChangeAspect="1"/>
+            </wp:cNvGraphicFramePr>
+            <a:graphic xmlns:a="http://schemas.openxmlformats.org/drawingml/2006/main">
+              <a:graphicData uri="http://schemas.openxmlformats.org/drawingml/2006/picture">
+                <pic:pic xmlns:pic="http://schemas.openxmlformats.org/drawingml/2006/picture">
+                  <pic:nvPicPr>
+                    <pic:cNvPr id="133" name="Picture 133"/>
+                    <pic:cNvPicPr>
+                      <a:picLocks noChangeAspect="1"/>
+                    </pic:cNvPicPr>
+                  </pic:nvPicPr>
+                  <pic:blipFill>
+                    <a:blip r:embed="rId6"/>
+                    <a:stretch>
+                      <a:fillRect/>
+                    </a:stretch>
+                  </pic:blipFill>
+                  <pic:spPr>
+                    <a:xfrm>
+                      <a:off x="0" y="0"/>
+                      <a:ext cx="5220000" cy="3262500"/>
+                    </a:xfrm>
+                    <a:prstGeom prst="rect">
+                      <a:avLst/>
+                    </a:prstGeom>
+                  </pic:spPr>
+                </pic:pic>
+              </a:graphicData>
+            </a:graphic>
+          </wp:inline>
+        </w:drawing>
+      </w:r>
+    </w:p>
+    <w:p>
+      <w:r>
+        <w:t>Figure 1. A representative FL vs FedHDS training convergence run (data sampling ratio 0.4, 20 rounds). In this representative run, FedHDS converges to a lower final global loss than FL. Across the five valid seeds, however, the mean baseline gap is small, so the unlearning comparisons are anchored to the same within-seed FedHDS checkpoint rather than to a universal claim that FedHDS always dominates FL.</w:t>
+      </w:r>
+    </w:p>
+    <w:p>
+      <w:r>
+        <w:t>For visual clarity, Figures 2 and 3 show representative runs from the same configuration, whereas the quantitative claims below rely on the five-seed aggregate in Table 3. Across these five valid seeds, FL and FedHDS remain close as training baselines, with a mean final-global-loss gap of only -0.0171 in favor of FL. The unlearning comparisons are therefore interpreted relative to the same pre-unlearning FedHDS checkpoint within each seed, which removes seed-level training variation from the utility comparison.</w:t>
+      </w:r>
+    </w:p>
+    <w:p>
+      <w:pPr>
+        <w:jc w:val="center"/>
+      </w:pPr>
+      <w:r>
+        <w:drawing>
+          <wp:inline distT="0" distB="0" distL="114300" distR="114300">
+            <wp:extent cx="5219700" cy="4326255"/>
+            <wp:effectExtent l="0" t="0" r="0" b="4445"/>
+            <wp:docPr id="134" name="Picture 134"/>
+            <wp:cNvGraphicFramePr>
+              <a:graphicFrameLocks xmlns:a="http://schemas.openxmlformats.org/drawingml/2006/main" noChangeAspect="1"/>
+            </wp:cNvGraphicFramePr>
+            <a:graphic xmlns:a="http://schemas.openxmlformats.org/drawingml/2006/main">
+              <a:graphicData uri="http://schemas.openxmlformats.org/drawingml/2006/picture">
+                <pic:pic xmlns:pic="http://schemas.openxmlformats.org/drawingml/2006/picture">
+                  <pic:nvPicPr>
+                    <pic:cNvPr id="134" name="Picture 134"/>
+                    <pic:cNvPicPr>
+                      <a:picLocks noChangeAspect="1"/>
+                    </pic:cNvPicPr>
+                  </pic:nvPicPr>
+                  <pic:blipFill>
+                    <a:blip r:embed="rId7"/>
+                    <a:stretch>
+                      <a:fillRect/>
+                    </a:stretch>
+                  </pic:blipFill>
+                  <pic:spPr>
+                    <a:xfrm>
+                      <a:off x="0" y="0"/>
+                      <a:ext cx="5220000" cy="4326517"/>
+                    </a:xfrm>
+                    <a:prstGeom prst="rect">
+                      <a:avLst/>
+                    </a:prstGeom>
+                  </pic:spPr>
+                </pic:pic>
+              </a:graphicData>
+            </a:graphic>
+          </wp:inline>
+        </w:drawing>
+      </w:r>
+    </w:p>
+    <w:p>
+      <w:r>
+        <w:t>Figure 2. Final global loss comparison for a representative run in the main trade-off configuration.</w:t>
+      </w:r>
+    </w:p>
+    <w:p>
+      <w:r>
+        <w:t>The aggregate result sharpens the single-run story. forget_batch_hessian gives the largest mean forgetting increase (+3.6769), but it does so at a much larger mean utility cost (+3.7339 global loss relative to the same-seed FedHDS baseline) and with substantial instability. In the five valid seeds, it is positive on forgetting in only 4/5 cases, and one seed (seed42) collapses to final global loss 18.5533. Another seed (seed44) even shows a slight negative forget delta (-0.0109). The direct forget-batch curvature reference is therefore strong but unreliable.</w:t>
+      </w:r>
+    </w:p>
+    <w:p>
+      <w:r>
+        <w:t>Figure 3 shows the representative sign-misalignment case from the forget-client side, which motivated the later negative-direction correction and guard design.</w:t>
+      </w:r>
+    </w:p>
+    <w:p>
+      <w:pPr>
+        <w:jc w:val="center"/>
+      </w:pPr>
+      <w:r>
+        <w:drawing>
+          <wp:inline distT="0" distB="0" distL="114300" distR="114300">
+            <wp:extent cx="5219700" cy="4328795"/>
+            <wp:effectExtent l="0" t="0" r="0" b="1905"/>
+            <wp:docPr id="135" name="Picture 135"/>
+            <wp:cNvGraphicFramePr>
+              <a:graphicFrameLocks xmlns:a="http://schemas.openxmlformats.org/drawingml/2006/main" noChangeAspect="1"/>
+            </wp:cNvGraphicFramePr>
+            <a:graphic xmlns:a="http://schemas.openxmlformats.org/drawingml/2006/main">
+              <a:graphicData uri="http://schemas.openxmlformats.org/drawingml/2006/picture">
+                <pic:pic xmlns:pic="http://schemas.openxmlformats.org/drawingml/2006/picture">
+                  <pic:nvPicPr>
+                    <pic:cNvPr id="135" name="Picture 135"/>
+                    <pic:cNvPicPr>
+                      <a:picLocks noChangeAspect="1"/>
+                    </pic:cNvPicPr>
+                  </pic:nvPicPr>
+                  <pic:blipFill>
+                    <a:blip r:embed="rId8"/>
+                    <a:stretch>
+                      <a:fillRect/>
+                    </a:stretch>
+                  </pic:blipFill>
+                  <pic:spPr>
+                    <a:xfrm>
+                      <a:off x="0" y="0"/>
+                      <a:ext cx="5220000" cy="4329367"/>
+                    </a:xfrm>
+                    <a:prstGeom prst="rect">
+                      <a:avLst/>
+                    </a:prstGeom>
+                  </pic:spPr>
+                </pic:pic>
+              </a:graphicData>
+            </a:graphic>
+          </wp:inline>
+        </w:drawing>
+      </w:r>
+    </w:p>
+    <w:p>
+      <w:r>
+        <w:t>Figure 3. Forget-client loss before and after unlearning for a representative run in the main trade-off configuration.</w:t>
+      </w:r>
+    </w:p>
+    <w:p>
+      <w:r>
+        <w:t>By contrast, retained_negative_guard is the most balanced second-order method in the five-seed suite. It increases forget-client loss in 5/5 valid seeds, with mean Deltaforget = +0.4011, while raising global loss by only +0.0618 on average relative to the same-seed FedHDS baselines. Its mean update norm is only 0.0636, and the stepped guard accepts 3.2/4.0 steps on average before stopping, usually because of the global-loss guard. This makes the method auditable and repeatable, even though the forgetting gain is smaller than that of the most aggressive forget-batch update. The two first-order controls, ga and ga_guarded, are even more utility-preserving, but their forgetting gains are much weaker. Both methods remain positive on forgetting in 5/5 seeds, yet their mean forget increases are only about +0.01, more than an order of magnitude smaller than that of retained_negative_guard. They are therefore useful conservative controls, but not strong standalone unlearning solutions in this setting. The retrain reference also clarifies the boundary of what this split can support. Across the five valid seeds, retrain_oracle leaves the tracked forget-loss proxy unchanged (Deltaforget = 0) and stays near the FedHDS utility level (Deltaglobal = +0.0012). It remains a useful exclusion reference, but not a stronger forgetting benchmark than the guarded post-training updates.</w:t>
       </w:r>
     </w:p>
     <w:p>
@@ -2837,7 +3311,7 @@
     </w:p>
     <w:tbl>
       <w:tblPr>
-        <w:tblStyle w:val="5"/>
+        <w:tblStyle w:val="7"/>
         <w:tblW w:w="0" w:type="auto"/>
         <w:tblInd w:w="0" w:type="dxa"/>
         <w:tblBorders>
@@ -3054,7 +3528,7 @@
     </w:p>
     <w:tbl>
       <w:tblPr>
-        <w:tblStyle w:val="5"/>
+        <w:tblStyle w:val="7"/>
         <w:tblW w:w="0" w:type="auto"/>
         <w:tblInd w:w="0" w:type="dxa"/>
         <w:tblBorders>
@@ -3437,7 +3911,7 @@
     </w:tbl>
     <w:p>
       <w:r>
-        <w:t>Table 5 shows the correction result once the sign is flipped. The maximum-norm-0.05 case is the most conservative and gives the smallest global-loss increase. The maximum-norm-0.10 case provides the clearest forgetting gain while remaining within controlled utility degradation, and is therefore the preferred corrected setting. The maximum-norm-0.15 case is useful mainly as a guard-stopping example: the stepped guard truncates the update at 4/5 steps before the full requested norm is applied. Additional norm-sweep plots are omitted from the main text because they do not change this conclusion.</w:t>
+        <w:t>Table 5 shows the correction result once the sign is flipped. The maximum-norm-0.05 case is the most conservative and gives the smallest global-loss increase. The maximum-norm-0.10 case provides the clearest forgetting gain while remaining within controlled utility degradation, and is therefore the preferred corrected setting. The maximum-norm-0.15 case is useful mainly as a guard-stopping example: the stepped guard truncates the update at 4/5 steps before the full requested norm is applied. Additional norm-sweep plots are omitted from the main text because they do not change this conclusion. The five-seed aggregate in Table 3 is consistent with this mechanism diagnosis: once the sign is corrected and the guards are enforced, retained_negative_guard remains positive on forgetting in all five valid seeds.</w:t>
       </w:r>
     </w:p>
     <w:p>
@@ -3455,7 +3929,7 @@
     </w:p>
     <w:p>
       <w:r>
-        <w:t>The scale study is kept compact because its role is confirmatory rather than exploratory. Table 5 summarizes the 2 x 2 matrix over model size and data sampling ratio using one representative retained-set negative-direction update (maximum norm 0.10) and the forget-batch baseline.</w:t>
+        <w:t>The scale study is kept compact because its role is confirmatory rather than exploratory. Table 6 summarizes the 2 x 2 matrix over model size and data sampling ratio using one representative retained-set negative-direction update (maximum norm 0.10) and the forget-batch baseline.</w:t>
       </w:r>
     </w:p>
     <w:p>
@@ -3465,7 +3939,7 @@
     </w:p>
     <w:tbl>
       <w:tblPr>
-        <w:tblStyle w:val="5"/>
+        <w:tblStyle w:val="7"/>
         <w:tblW w:w="0" w:type="auto"/>
         <w:tblInd w:w="0" w:type="dxa"/>
         <w:tblBorders>
@@ -3485,12 +3959,12 @@
         </w:tblCellMar>
       </w:tblPr>
       <w:tblGrid>
-        <w:gridCol w:w="1200"/>
-        <w:gridCol w:w="1821"/>
-        <w:gridCol w:w="1007"/>
-        <w:gridCol w:w="1335"/>
-        <w:gridCol w:w="1662"/>
-        <w:gridCol w:w="1695"/>
+        <w:gridCol w:w="1373"/>
+        <w:gridCol w:w="1645"/>
+        <w:gridCol w:w="1147"/>
+        <w:gridCol w:w="1532"/>
+        <w:gridCol w:w="1399"/>
+        <w:gridCol w:w="1624"/>
       </w:tblGrid>
       <w:tr>
         <w:tblPrEx>
@@ -3893,12 +4367,12 @@
         <w:pStyle w:val="3"/>
       </w:pPr>
       <w:r>
-        <w:t>5.5 Seed Robustness under the Large-model/Large-data Setting</w:t>
-      </w:r>
-    </w:p>
-    <w:p>
-      <w:r>
-        <w:t>Seed robustness is treated as boundary evidence rather than as a full new result section. Under the same large-model/large-data configuration, seed 42 reproduces a small positive forgetting gain, seed 43 remains near-neutral on forgetting while preserving utility, and seed 44 is rejected by the forget-loss guard at 0/1 steps. The stable conclusion across seeds is therefore global-loss control rather than guaranteed forgetting strength. Detailed per-seed tables are omitted from the main text for brevity.</w:t>
+        <w:t>5.5 Seed Robustness under the Main Dirichlet alpha=0.5 Setting</w:t>
+      </w:r>
+    </w:p>
+    <w:p>
+      <w:r>
+        <w:t>Table 3 already provides the main seed-robustness evidence under the central Qwen2-0.5B, data-sampling-ratio-0.4, 20-round setting. Across the five valid seeds 42, 43, 44, 45, 47, retained_negative_guard is positive on forgetting in 5/5 cases, ga and ga_guarded are also positive in 5/5 cases but remain much weaker, and forget_batch_hessian is positive in only 4/5 cases while exhibiting much larger utility variance. The stable conclusion across seeds is therefore not that every method forgets equally well, but that sign-corrected retained-set curvature is the only non-trivial second-order update in this suite that remains positive on forgetting in every valid seed while keeping the utility cost bounded. An additional run, seed46, is not pooled into the main comparison because it fails earlier than the unlearning stage. Its baseline runs (FL, FedHDS, and retrain_oracle) all reach round2_global_loss = 10.0, which indicates training-time divergence rather than an unlearning-specific failure. The run is therefore archived as an appendix anomaly instead of being treated as method evidence. This distinction matters: the variability that remains after removing the anomalous seed is primarily about the magnitude of forgetting gain, not about whether guarded retained-set updates flip to the wrong sign.</w:t>
       </w:r>
     </w:p>
     <w:p>
@@ -3911,7 +4385,7 @@
     </w:p>
     <w:p>
       <w:r>
-        <w:t>This study remains limited to Dolly, the Qwen/Qwen2.5 family, one federated configuration, and a single designated forget client. Forget-client loss is still an operational proxy rather than a gold-standard forgetting metric, and the seed check shows that exact forgetting gain is trajectory-sensitive. Future work should test broader datasets, multi-client removal, and cheaper retained-set HVP implementations.</w:t>
+        <w:t>This study remains limited to Dolly, the Qwen/Qwen2.5 family, one federated configuration, and a single designated forget client. Forget-client loss is still an operational proxy rather than a gold-standard forgetting metric, and the five-seed suite shows that the magnitude of forgetting gain remains trajectory-sensitive even after an obviously divergent seed is removed. The current loss-based MIA values are also too weak to carry the main argument and are therefore treated only as supplementary indicators. Future work should test broader datasets, multi-client removal, stronger privacy audits, and cheaper retained-set HVP implementations.</w:t>
       </w:r>
     </w:p>
     <w:p>
@@ -3924,7 +4398,7 @@
     </w:p>
     <w:p>
       <w:r>
-        <w:t>This paper studies post-training federated unlearning on top of a fixed FedHDS checkpoint. First, it establishes a protocol that isolates unlearning behavior from federated training quality and verifies that the full pipeline can be measured end to end. Second, it shows that retained-set curvature becomes useful only after direction validation and guard control, because the main difficulty is not the absence of a forgetting signal but sign-sensitive mismatch under utility constraints. Third, the scale and seed checks support a bounded claim: the method is better understood as a utility-preserving and auditable approximate unlearning framework than as a universally strongest forgetting method.</w:t>
+        <w:t>This paper studies post-training federated unlearning on top of a fixed FedHDS checkpoint. First, it establishes a protocol that isolates unlearning behavior from federated training quality and verifies that the full pipeline can be measured end to end. Second, the five-seed main suite shows that retained-set curvature becomes useful only after direction validation and guard control: the sign-corrected guarded update is positive on forgetting in all five valid seeds while adding only +0.0618 mean global loss relative to the corresponding FedHDS baselines. Third, the same suite also clarifies the boundary of the method: forget-batch curvature can forget more aggressively, but it is substantially less stable, while GA-style guarded first-order updates are stable but too weak to serve as the main unlearning mechanism. The resulting claim is therefore deliberately bounded. The proposed method is best understood as a utility-preserving and auditable approximate unlearning framework, not as a universally strongest forgetting update in every regime.</w:t>
       </w:r>
     </w:p>
     <w:p>
@@ -3953,7 +4427,7 @@
     </w:p>
     <w:p>
       <w:pPr>
-        <w:pStyle w:val="7"/>
+        <w:pStyle w:val="9"/>
       </w:pPr>
     </w:p>
     <w:p>
@@ -3968,7 +4442,7 @@
     </w:p>
     <w:p>
       <w:pPr>
-        <w:pStyle w:val="7"/>
+        <w:pStyle w:val="9"/>
       </w:pPr>
     </w:p>
     <w:p>
@@ -3983,7 +4457,7 @@
     </w:p>
     <w:p>
       <w:pPr>
-        <w:pStyle w:val="7"/>
+        <w:pStyle w:val="9"/>
       </w:pPr>
     </w:p>
     <w:p>
@@ -3998,7 +4472,7 @@
     </w:p>
     <w:p>
       <w:pPr>
-        <w:pStyle w:val="7"/>
+        <w:pStyle w:val="9"/>
       </w:pPr>
     </w:p>
     <w:p>
@@ -4013,7 +4487,7 @@
     </w:p>
     <w:p>
       <w:pPr>
-        <w:pStyle w:val="7"/>
+        <w:pStyle w:val="9"/>
       </w:pPr>
     </w:p>
     <w:p>
@@ -4028,7 +4502,7 @@
     </w:p>
     <w:p>
       <w:pPr>
-        <w:pStyle w:val="7"/>
+        <w:pStyle w:val="9"/>
       </w:pPr>
     </w:p>
     <w:p>
@@ -4043,7 +4517,7 @@
     </w:p>
     <w:p>
       <w:pPr>
-        <w:pStyle w:val="7"/>
+        <w:pStyle w:val="9"/>
       </w:pPr>
     </w:p>
     <w:p>
@@ -4058,7 +4532,7 @@
     </w:p>
     <w:p>
       <w:pPr>
-        <w:pStyle w:val="7"/>
+        <w:pStyle w:val="9"/>
       </w:pPr>
     </w:p>
     <w:p>
@@ -4073,7 +4547,7 @@
     </w:p>
     <w:p>
       <w:pPr>
-        <w:pStyle w:val="7"/>
+        <w:pStyle w:val="9"/>
       </w:pPr>
     </w:p>
     <w:p>
@@ -4088,7 +4562,7 @@
     </w:p>
     <w:p>
       <w:pPr>
-        <w:pStyle w:val="7"/>
+        <w:pStyle w:val="9"/>
       </w:pPr>
     </w:p>
     <w:p>
@@ -4103,7 +4577,7 @@
     </w:p>
     <w:p>
       <w:pPr>
-        <w:pStyle w:val="7"/>
+        <w:pStyle w:val="9"/>
       </w:pPr>
     </w:p>
     <w:p>
@@ -4118,7 +4592,7 @@
     </w:p>
     <w:p>
       <w:pPr>
-        <w:pStyle w:val="7"/>
+        <w:pStyle w:val="9"/>
       </w:pPr>
     </w:p>
     <w:p>
@@ -4133,7 +4607,7 @@
     </w:p>
     <w:p>
       <w:pPr>
-        <w:pStyle w:val="7"/>
+        <w:pStyle w:val="9"/>
       </w:pPr>
     </w:p>
     <w:p>
@@ -4148,7 +4622,7 @@
     </w:p>
     <w:p>
       <w:pPr>
-        <w:pStyle w:val="7"/>
+        <w:pStyle w:val="9"/>
       </w:pPr>
     </w:p>
     <w:p>
@@ -4163,7 +4637,7 @@
     </w:p>
     <w:p>
       <w:pPr>
-        <w:pStyle w:val="7"/>
+        <w:pStyle w:val="9"/>
       </w:pPr>
     </w:p>
     <w:p>
@@ -4178,7 +4652,7 @@
     </w:p>
     <w:p>
       <w:pPr>
-        <w:pStyle w:val="7"/>
+        <w:pStyle w:val="9"/>
       </w:pPr>
     </w:p>
     <w:p>
@@ -4193,7 +4667,7 @@
     </w:p>
     <w:p>
       <w:pPr>
-        <w:pStyle w:val="7"/>
+        <w:pStyle w:val="9"/>
       </w:pPr>
     </w:p>
     <w:p>
@@ -4229,7 +4703,7 @@
                     <pic:cNvPicPr/>
                   </pic:nvPicPr>
                   <pic:blipFill>
-                    <a:blip r:embed="rId6"/>
+                    <a:blip r:embed="rId9"/>
                     <a:stretch>
                       <a:fillRect/>
                     </a:stretch>
@@ -4252,7 +4726,7 @@
     </w:p>
     <w:p>
       <w:pPr>
-        <w:pStyle w:val="4"/>
+        <w:pStyle w:val="5"/>
       </w:pPr>
       <w:r>
         <w:rPr>
@@ -4282,7 +4756,7 @@
                     <pic:cNvPicPr/>
                   </pic:nvPicPr>
                   <pic:blipFill>
-                    <a:blip r:embed="rId7"/>
+                    <a:blip r:embed="rId10"/>
                     <a:stretch>
                       <a:fillRect/>
                     </a:stretch>
@@ -4305,7 +4779,7 @@
     </w:p>
     <w:p>
       <w:pPr>
-        <w:pStyle w:val="4"/>
+        <w:pStyle w:val="5"/>
       </w:pPr>
       <w:r>
         <w:rPr>
@@ -4335,7 +4809,7 @@
                     <pic:cNvPicPr/>
                   </pic:nvPicPr>
                   <pic:blipFill>
-                    <a:blip r:embed="rId8"/>
+                    <a:blip r:embed="rId11"/>
                     <a:stretch>
                       <a:fillRect/>
                     </a:stretch>
@@ -4358,7 +4832,7 @@
     </w:p>
     <w:p>
       <w:pPr>
-        <w:pStyle w:val="4"/>
+        <w:pStyle w:val="5"/>
       </w:pPr>
       <w:r>
         <w:rPr>
@@ -4388,7 +4862,7 @@
                     <pic:cNvPicPr/>
                   </pic:nvPicPr>
                   <pic:blipFill>
-                    <a:blip r:embed="rId9"/>
+                    <a:blip r:embed="rId12"/>
                     <a:stretch>
                       <a:fillRect/>
                     </a:stretch>
@@ -4411,7 +4885,7 @@
     </w:p>
     <w:p>
       <w:pPr>
-        <w:pStyle w:val="4"/>
+        <w:pStyle w:val="5"/>
       </w:pPr>
       <w:r>
         <w:rPr>
@@ -4441,7 +4915,7 @@
                     <pic:cNvPicPr/>
                   </pic:nvPicPr>
                   <pic:blipFill>
-                    <a:blip r:embed="rId10"/>
+                    <a:blip r:embed="rId13"/>
                     <a:stretch>
                       <a:fillRect/>
                     </a:stretch>
@@ -4464,7 +4938,7 @@
     </w:p>
     <w:p>
       <w:pPr>
-        <w:pStyle w:val="4"/>
+        <w:pStyle w:val="5"/>
       </w:pPr>
       <w:r>
         <w:rPr>
@@ -4494,7 +4968,7 @@
                     <pic:cNvPicPr/>
                   </pic:nvPicPr>
                   <pic:blipFill>
-                    <a:blip r:embed="rId11"/>
+                    <a:blip r:embed="rId14"/>
                     <a:stretch>
                       <a:fillRect/>
                     </a:stretch>
@@ -4517,7 +4991,7 @@
     </w:p>
     <w:p>
       <w:pPr>
-        <w:pStyle w:val="4"/>
+        <w:pStyle w:val="5"/>
       </w:pPr>
       <w:r>
         <w:rPr>
@@ -4544,165 +5018,6 @@
                 <pic:pic xmlns:pic="http://schemas.openxmlformats.org/drawingml/2006/picture">
                   <pic:nvPicPr>
                     <pic:cNvPr id="115" name="Figure A7. Stage 2: update norm versus final global loss."/>
-                    <pic:cNvPicPr/>
-                  </pic:nvPicPr>
-                  <pic:blipFill>
-                    <a:blip r:embed="rId12"/>
-                    <a:stretch>
-                      <a:fillRect/>
-                    </a:stretch>
-                  </pic:blipFill>
-                  <pic:spPr>
-                    <a:xfrm>
-                      <a:off x="0" y="0"/>
-                      <a:ext cx="5400000" cy="3532354"/>
-                    </a:xfrm>
-                    <a:prstGeom prst="rect">
-                      <a:avLst/>
-                    </a:prstGeom>
-                  </pic:spPr>
-                </pic:pic>
-              </a:graphicData>
-            </a:graphic>
-          </wp:inline>
-        </w:drawing>
-      </w:r>
-    </w:p>
-    <w:p>
-      <w:pPr>
-        <w:pStyle w:val="4"/>
-      </w:pPr>
-      <w:r>
-        <w:rPr>
-          <w:rFonts w:ascii="Times New Roman" w:hAnsi="Times New Roman" w:eastAsia="宋体"/>
-          <w:sz w:val="21"/>
-          <w:szCs w:val="21"/>
-        </w:rPr>
-        <w:t>Figure A7. Stage 2: update norm versus final global loss.</w:t>
-      </w:r>
-    </w:p>
-    <w:p>
-      <w:pPr>
-        <w:jc w:val="center"/>
-      </w:pPr>
-      <w:r>
-        <w:drawing>
-          <wp:inline distT="0" distB="0" distL="0" distR="0">
-            <wp:extent cx="5399405" cy="4227195"/>
-            <wp:effectExtent l="0" t="0" r="10795" b="1905"/>
-            <wp:docPr id="116" name="Figure A8. Stage 3: final global loss comparison."/>
-            <wp:cNvGraphicFramePr/>
-            <a:graphic xmlns:a="http://schemas.openxmlformats.org/drawingml/2006/main">
-              <a:graphicData uri="http://schemas.openxmlformats.org/drawingml/2006/picture">
-                <pic:pic xmlns:pic="http://schemas.openxmlformats.org/drawingml/2006/picture">
-                  <pic:nvPicPr>
-                    <pic:cNvPr id="116" name="Figure A8. Stage 3: final global loss comparison."/>
-                    <pic:cNvPicPr/>
-                  </pic:nvPicPr>
-                  <pic:blipFill>
-                    <a:blip r:embed="rId13"/>
-                    <a:stretch>
-                      <a:fillRect/>
-                    </a:stretch>
-                  </pic:blipFill>
-                  <pic:spPr>
-                    <a:xfrm>
-                      <a:off x="0" y="0"/>
-                      <a:ext cx="5400000" cy="4227483"/>
-                    </a:xfrm>
-                    <a:prstGeom prst="rect">
-                      <a:avLst/>
-                    </a:prstGeom>
-                  </pic:spPr>
-                </pic:pic>
-              </a:graphicData>
-            </a:graphic>
-          </wp:inline>
-        </w:drawing>
-      </w:r>
-    </w:p>
-    <w:p>
-      <w:pPr>
-        <w:pStyle w:val="4"/>
-      </w:pPr>
-      <w:r>
-        <w:rPr>
-          <w:rFonts w:ascii="Times New Roman" w:hAnsi="Times New Roman" w:eastAsia="宋体"/>
-          <w:sz w:val="21"/>
-          <w:szCs w:val="21"/>
-        </w:rPr>
-        <w:t>Figure A8. Stage 3: final global loss comparison.</w:t>
-      </w:r>
-    </w:p>
-    <w:p>
-      <w:pPr>
-        <w:jc w:val="center"/>
-      </w:pPr>
-      <w:r>
-        <w:drawing>
-          <wp:inline distT="0" distB="0" distL="0" distR="0">
-            <wp:extent cx="5399405" cy="4549140"/>
-            <wp:effectExtent l="0" t="0" r="10795" b="10160"/>
-            <wp:docPr id="117" name="Figure A9. Stage 3: forget-client loss before and after unlearning."/>
-            <wp:cNvGraphicFramePr/>
-            <a:graphic xmlns:a="http://schemas.openxmlformats.org/drawingml/2006/main">
-              <a:graphicData uri="http://schemas.openxmlformats.org/drawingml/2006/picture">
-                <pic:pic xmlns:pic="http://schemas.openxmlformats.org/drawingml/2006/picture">
-                  <pic:nvPicPr>
-                    <pic:cNvPr id="117" name="Figure A9. Stage 3: forget-client loss before and after unlearning."/>
-                    <pic:cNvPicPr/>
-                  </pic:nvPicPr>
-                  <pic:blipFill>
-                    <a:blip r:embed="rId14"/>
-                    <a:stretch>
-                      <a:fillRect/>
-                    </a:stretch>
-                  </pic:blipFill>
-                  <pic:spPr>
-                    <a:xfrm>
-                      <a:off x="0" y="0"/>
-                      <a:ext cx="5400000" cy="4549551"/>
-                    </a:xfrm>
-                    <a:prstGeom prst="rect">
-                      <a:avLst/>
-                    </a:prstGeom>
-                  </pic:spPr>
-                </pic:pic>
-              </a:graphicData>
-            </a:graphic>
-          </wp:inline>
-        </w:drawing>
-      </w:r>
-    </w:p>
-    <w:p>
-      <w:pPr>
-        <w:pStyle w:val="4"/>
-      </w:pPr>
-      <w:r>
-        <w:rPr>
-          <w:rFonts w:ascii="Times New Roman" w:hAnsi="Times New Roman" w:eastAsia="宋体"/>
-          <w:sz w:val="21"/>
-          <w:szCs w:val="21"/>
-        </w:rPr>
-        <w:t>Figure A9. Stage 3: forget-client loss before and after unlearning.</w:t>
-      </w:r>
-    </w:p>
-    <w:p>
-      <w:pPr>
-        <w:jc w:val="center"/>
-      </w:pPr>
-      <w:r>
-        <w:drawing>
-          <wp:inline distT="0" distB="0" distL="0" distR="0">
-            <wp:extent cx="5399405" cy="3531870"/>
-            <wp:effectExtent l="0" t="0" r="10795" b="11430"/>
-            <wp:docPr id="118" name="Figure A10. Stage 3: update norm versus final global loss."/>
-            <wp:cNvGraphicFramePr/>
-            <a:graphic xmlns:a="http://schemas.openxmlformats.org/drawingml/2006/main">
-              <a:graphicData uri="http://schemas.openxmlformats.org/drawingml/2006/picture">
-                <pic:pic xmlns:pic="http://schemas.openxmlformats.org/drawingml/2006/picture">
-                  <pic:nvPicPr>
-                    <pic:cNvPr id="118" name="Figure A10. Stage 3: update norm versus final global loss."/>
                     <pic:cNvPicPr/>
                   </pic:nvPicPr>
                   <pic:blipFill>
@@ -4729,7 +5044,7 @@
     </w:p>
     <w:p>
       <w:pPr>
-        <w:pStyle w:val="4"/>
+        <w:pStyle w:val="5"/>
       </w:pPr>
       <w:r>
         <w:rPr>
@@ -4737,7 +5052,7 @@
           <w:sz w:val="21"/>
           <w:szCs w:val="21"/>
         </w:rPr>
-        <w:t>Figure A10. Stage 3: update norm versus final global loss.</w:t>
+        <w:t>Figure A7. Stage 2: update norm versus final global loss.</w:t>
       </w:r>
     </w:p>
     <w:p>
@@ -4747,19 +5062,72 @@
       <w:r>
         <w:drawing>
           <wp:inline distT="0" distB="0" distL="0" distR="0">
-            <wp:extent cx="5399405" cy="4549140"/>
-            <wp:effectExtent l="0" t="0" r="10795" b="10160"/>
-            <wp:docPr id="119" name="Figure A11. Stage 4A: accepted and attempted guard steps."/>
+            <wp:extent cx="5399405" cy="4227195"/>
+            <wp:effectExtent l="0" t="0" r="10795" b="1905"/>
+            <wp:docPr id="116" name="Figure A8. Stage 3: final global loss comparison."/>
             <wp:cNvGraphicFramePr/>
             <a:graphic xmlns:a="http://schemas.openxmlformats.org/drawingml/2006/main">
               <a:graphicData uri="http://schemas.openxmlformats.org/drawingml/2006/picture">
                 <pic:pic xmlns:pic="http://schemas.openxmlformats.org/drawingml/2006/picture">
                   <pic:nvPicPr>
-                    <pic:cNvPr id="119" name="Figure A11. Stage 4A: accepted and attempted guard steps."/>
+                    <pic:cNvPr id="116" name="Figure A8. Stage 3: final global loss comparison."/>
                     <pic:cNvPicPr/>
                   </pic:nvPicPr>
                   <pic:blipFill>
                     <a:blip r:embed="rId16"/>
+                    <a:stretch>
+                      <a:fillRect/>
+                    </a:stretch>
+                  </pic:blipFill>
+                  <pic:spPr>
+                    <a:xfrm>
+                      <a:off x="0" y="0"/>
+                      <a:ext cx="5400000" cy="4227483"/>
+                    </a:xfrm>
+                    <a:prstGeom prst="rect">
+                      <a:avLst/>
+                    </a:prstGeom>
+                  </pic:spPr>
+                </pic:pic>
+              </a:graphicData>
+            </a:graphic>
+          </wp:inline>
+        </w:drawing>
+      </w:r>
+    </w:p>
+    <w:p>
+      <w:pPr>
+        <w:pStyle w:val="5"/>
+      </w:pPr>
+      <w:r>
+        <w:rPr>
+          <w:rFonts w:ascii="Times New Roman" w:hAnsi="Times New Roman" w:eastAsia="宋体"/>
+          <w:sz w:val="21"/>
+          <w:szCs w:val="21"/>
+        </w:rPr>
+        <w:t>Figure A8. Stage 3: final global loss comparison.</w:t>
+      </w:r>
+    </w:p>
+    <w:p>
+      <w:pPr>
+        <w:jc w:val="center"/>
+      </w:pPr>
+      <w:r>
+        <w:drawing>
+          <wp:inline distT="0" distB="0" distL="0" distR="0">
+            <wp:extent cx="5399405" cy="4549140"/>
+            <wp:effectExtent l="0" t="0" r="10795" b="10160"/>
+            <wp:docPr id="117" name="Figure A9. Stage 3: forget-client loss before and after unlearning."/>
+            <wp:cNvGraphicFramePr/>
+            <a:graphic xmlns:a="http://schemas.openxmlformats.org/drawingml/2006/main">
+              <a:graphicData uri="http://schemas.openxmlformats.org/drawingml/2006/picture">
+                <pic:pic xmlns:pic="http://schemas.openxmlformats.org/drawingml/2006/picture">
+                  <pic:nvPicPr>
+                    <pic:cNvPr id="117" name="Figure A9. Stage 3: forget-client loss before and after unlearning."/>
+                    <pic:cNvPicPr/>
+                  </pic:nvPicPr>
+                  <pic:blipFill>
+                    <a:blip r:embed="rId17"/>
                     <a:stretch>
                       <a:fillRect/>
                     </a:stretch>
@@ -4782,7 +5150,7 @@
     </w:p>
     <w:p>
       <w:pPr>
-        <w:pStyle w:val="4"/>
+        <w:pStyle w:val="5"/>
       </w:pPr>
       <w:r>
         <w:rPr>
@@ -4790,7 +5158,7 @@
           <w:sz w:val="21"/>
           <w:szCs w:val="21"/>
         </w:rPr>
-        <w:t>Figure A11. Stage 4A: accepted and attempted guard steps.</w:t>
+        <w:t>Figure A9. Stage 3: forget-client loss before and after unlearning.</w:t>
       </w:r>
     </w:p>
     <w:p>
@@ -4800,68 +5168,15 @@
       <w:r>
         <w:drawing>
           <wp:inline distT="0" distB="0" distL="0" distR="0">
-            <wp:extent cx="5399405" cy="4566920"/>
-            <wp:effectExtent l="0" t="0" r="10795" b="5080"/>
-            <wp:docPr id="120" name="Figure A12. Stage 4A: unlearning time comparison."/>
+            <wp:extent cx="5399405" cy="3531870"/>
+            <wp:effectExtent l="0" t="0" r="10795" b="11430"/>
+            <wp:docPr id="118" name="Figure A10. Stage 3: update norm versus final global loss."/>
             <wp:cNvGraphicFramePr/>
             <a:graphic xmlns:a="http://schemas.openxmlformats.org/drawingml/2006/main">
               <a:graphicData uri="http://schemas.openxmlformats.org/drawingml/2006/picture">
                 <pic:pic xmlns:pic="http://schemas.openxmlformats.org/drawingml/2006/picture">
                   <pic:nvPicPr>
-                    <pic:cNvPr id="120" name="Figure A12. Stage 4A: unlearning time comparison."/>
-                    <pic:cNvPicPr/>
-                  </pic:nvPicPr>
-                  <pic:blipFill>
-                    <a:blip r:embed="rId17"/>
-                    <a:stretch>
-                      <a:fillRect/>
-                    </a:stretch>
-                  </pic:blipFill>
-                  <pic:spPr>
-                    <a:xfrm>
-                      <a:off x="0" y="0"/>
-                      <a:ext cx="5400000" cy="4567095"/>
-                    </a:xfrm>
-                    <a:prstGeom prst="rect">
-                      <a:avLst/>
-                    </a:prstGeom>
-                  </pic:spPr>
-                </pic:pic>
-              </a:graphicData>
-            </a:graphic>
-          </wp:inline>
-        </w:drawing>
-      </w:r>
-    </w:p>
-    <w:p>
-      <w:pPr>
-        <w:pStyle w:val="4"/>
-      </w:pPr>
-      <w:r>
-        <w:rPr>
-          <w:rFonts w:ascii="Times New Roman" w:hAnsi="Times New Roman" w:eastAsia="宋体"/>
-          <w:sz w:val="21"/>
-          <w:szCs w:val="21"/>
-        </w:rPr>
-        <w:t>Figure A12. Stage 4A: unlearning time comparison.</w:t>
-      </w:r>
-    </w:p>
-    <w:p>
-      <w:pPr>
-        <w:jc w:val="center"/>
-      </w:pPr>
-      <w:r>
-        <w:drawing>
-          <wp:inline distT="0" distB="0" distL="0" distR="0">
-            <wp:extent cx="5399405" cy="3531870"/>
-            <wp:effectExtent l="0" t="0" r="10795" b="11430"/>
-            <wp:docPr id="121" name="Figure A13. Stage 4A: update norm versus forget-loss gain."/>
-            <wp:cNvGraphicFramePr/>
-            <a:graphic xmlns:a="http://schemas.openxmlformats.org/drawingml/2006/main">
-              <a:graphicData uri="http://schemas.openxmlformats.org/drawingml/2006/picture">
-                <pic:pic xmlns:pic="http://schemas.openxmlformats.org/drawingml/2006/picture">
-                  <pic:nvPicPr>
-                    <pic:cNvPr id="121" name="Figure A13. Stage 4A: update norm versus forget-loss gain."/>
+                    <pic:cNvPr id="118" name="Figure A10. Stage 3: update norm versus final global loss."/>
                     <pic:cNvPicPr/>
                   </pic:nvPicPr>
                   <pic:blipFill>
@@ -4888,7 +5203,7 @@
     </w:p>
     <w:p>
       <w:pPr>
-        <w:pStyle w:val="4"/>
+        <w:pStyle w:val="5"/>
       </w:pPr>
       <w:r>
         <w:rPr>
@@ -4896,7 +5211,7 @@
           <w:sz w:val="21"/>
           <w:szCs w:val="21"/>
         </w:rPr>
-        <w:t>Figure A13. Stage 4A: update norm versus forget-loss gain.</w:t>
+        <w:t>Figure A10. Stage 3: update norm versus final global loss.</w:t>
       </w:r>
     </w:p>
     <w:p>
@@ -4908,13 +5223,13 @@
           <wp:inline distT="0" distB="0" distL="0" distR="0">
             <wp:extent cx="5399405" cy="4549140"/>
             <wp:effectExtent l="0" t="0" r="10795" b="10160"/>
-            <wp:docPr id="122" name="Figure A14. Stage 4B: accepted and attempted guard steps."/>
+            <wp:docPr id="119" name="Figure A11. Stage 4A: accepted and attempted guard steps."/>
             <wp:cNvGraphicFramePr/>
             <a:graphic xmlns:a="http://schemas.openxmlformats.org/drawingml/2006/main">
               <a:graphicData uri="http://schemas.openxmlformats.org/drawingml/2006/picture">
                 <pic:pic xmlns:pic="http://schemas.openxmlformats.org/drawingml/2006/picture">
                   <pic:nvPicPr>
-                    <pic:cNvPr id="122" name="Figure A14. Stage 4B: accepted and attempted guard steps."/>
+                    <pic:cNvPr id="119" name="Figure A11. Stage 4A: accepted and attempted guard steps."/>
                     <pic:cNvPicPr/>
                   </pic:nvPicPr>
                   <pic:blipFill>
@@ -4941,7 +5256,7 @@
     </w:p>
     <w:p>
       <w:pPr>
-        <w:pStyle w:val="4"/>
+        <w:pStyle w:val="5"/>
       </w:pPr>
       <w:r>
         <w:rPr>
@@ -4949,7 +5264,7 @@
           <w:sz w:val="21"/>
           <w:szCs w:val="21"/>
         </w:rPr>
-        <w:t>Figure A14. Stage 4B: accepted and attempted guard steps.</w:t>
+        <w:t>Figure A11. Stage 4A: accepted and attempted guard steps.</w:t>
       </w:r>
     </w:p>
     <w:p>
@@ -4961,13 +5276,13 @@
           <wp:inline distT="0" distB="0" distL="0" distR="0">
             <wp:extent cx="5399405" cy="4566920"/>
             <wp:effectExtent l="0" t="0" r="10795" b="5080"/>
-            <wp:docPr id="123" name="Figure A15. Stage 4B: unlearning time comparison."/>
+            <wp:docPr id="120" name="Figure A12. Stage 4A: unlearning time comparison."/>
             <wp:cNvGraphicFramePr/>
             <a:graphic xmlns:a="http://schemas.openxmlformats.org/drawingml/2006/main">
               <a:graphicData uri="http://schemas.openxmlformats.org/drawingml/2006/picture">
                 <pic:pic xmlns:pic="http://schemas.openxmlformats.org/drawingml/2006/picture">
                   <pic:nvPicPr>
-                    <pic:cNvPr id="123" name="Figure A15. Stage 4B: unlearning time comparison."/>
+                    <pic:cNvPr id="120" name="Figure A12. Stage 4A: unlearning time comparison."/>
                     <pic:cNvPicPr/>
                   </pic:nvPicPr>
                   <pic:blipFill>
@@ -4994,7 +5309,166 @@
     </w:p>
     <w:p>
       <w:pPr>
-        <w:pStyle w:val="4"/>
+        <w:pStyle w:val="5"/>
+      </w:pPr>
+      <w:r>
+        <w:rPr>
+          <w:rFonts w:ascii="Times New Roman" w:hAnsi="Times New Roman" w:eastAsia="宋体"/>
+          <w:sz w:val="21"/>
+          <w:szCs w:val="21"/>
+        </w:rPr>
+        <w:t>Figure A12. Stage 4A: unlearning time comparison.</w:t>
+      </w:r>
+    </w:p>
+    <w:p>
+      <w:pPr>
+        <w:jc w:val="center"/>
+      </w:pPr>
+      <w:r>
+        <w:drawing>
+          <wp:inline distT="0" distB="0" distL="0" distR="0">
+            <wp:extent cx="5399405" cy="3531870"/>
+            <wp:effectExtent l="0" t="0" r="10795" b="11430"/>
+            <wp:docPr id="121" name="Figure A13. Stage 4A: update norm versus forget-loss gain."/>
+            <wp:cNvGraphicFramePr/>
+            <a:graphic xmlns:a="http://schemas.openxmlformats.org/drawingml/2006/main">
+              <a:graphicData uri="http://schemas.openxmlformats.org/drawingml/2006/picture">
+                <pic:pic xmlns:pic="http://schemas.openxmlformats.org/drawingml/2006/picture">
+                  <pic:nvPicPr>
+                    <pic:cNvPr id="121" name="Figure A13. Stage 4A: update norm versus forget-loss gain."/>
+                    <pic:cNvPicPr/>
+                  </pic:nvPicPr>
+                  <pic:blipFill>
+                    <a:blip r:embed="rId21"/>
+                    <a:stretch>
+                      <a:fillRect/>
+                    </a:stretch>
+                  </pic:blipFill>
+                  <pic:spPr>
+                    <a:xfrm>
+                      <a:off x="0" y="0"/>
+                      <a:ext cx="5400000" cy="3532354"/>
+                    </a:xfrm>
+                    <a:prstGeom prst="rect">
+                      <a:avLst/>
+                    </a:prstGeom>
+                  </pic:spPr>
+                </pic:pic>
+              </a:graphicData>
+            </a:graphic>
+          </wp:inline>
+        </w:drawing>
+      </w:r>
+    </w:p>
+    <w:p>
+      <w:pPr>
+        <w:pStyle w:val="5"/>
+      </w:pPr>
+      <w:r>
+        <w:rPr>
+          <w:rFonts w:ascii="Times New Roman" w:hAnsi="Times New Roman" w:eastAsia="宋体"/>
+          <w:sz w:val="21"/>
+          <w:szCs w:val="21"/>
+        </w:rPr>
+        <w:t>Figure A13. Stage 4A: update norm versus forget-loss gain.</w:t>
+      </w:r>
+    </w:p>
+    <w:p>
+      <w:pPr>
+        <w:jc w:val="center"/>
+      </w:pPr>
+      <w:r>
+        <w:drawing>
+          <wp:inline distT="0" distB="0" distL="0" distR="0">
+            <wp:extent cx="5399405" cy="4549140"/>
+            <wp:effectExtent l="0" t="0" r="10795" b="10160"/>
+            <wp:docPr id="122" name="Figure A14. Stage 4B: accepted and attempted guard steps."/>
+            <wp:cNvGraphicFramePr/>
+            <a:graphic xmlns:a="http://schemas.openxmlformats.org/drawingml/2006/main">
+              <a:graphicData uri="http://schemas.openxmlformats.org/drawingml/2006/picture">
+                <pic:pic xmlns:pic="http://schemas.openxmlformats.org/drawingml/2006/picture">
+                  <pic:nvPicPr>
+                    <pic:cNvPr id="122" name="Figure A14. Stage 4B: accepted and attempted guard steps."/>
+                    <pic:cNvPicPr/>
+                  </pic:nvPicPr>
+                  <pic:blipFill>
+                    <a:blip r:embed="rId22"/>
+                    <a:stretch>
+                      <a:fillRect/>
+                    </a:stretch>
+                  </pic:blipFill>
+                  <pic:spPr>
+                    <a:xfrm>
+                      <a:off x="0" y="0"/>
+                      <a:ext cx="5400000" cy="4549551"/>
+                    </a:xfrm>
+                    <a:prstGeom prst="rect">
+                      <a:avLst/>
+                    </a:prstGeom>
+                  </pic:spPr>
+                </pic:pic>
+              </a:graphicData>
+            </a:graphic>
+          </wp:inline>
+        </w:drawing>
+      </w:r>
+    </w:p>
+    <w:p>
+      <w:pPr>
+        <w:pStyle w:val="5"/>
+      </w:pPr>
+      <w:r>
+        <w:rPr>
+          <w:rFonts w:ascii="Times New Roman" w:hAnsi="Times New Roman" w:eastAsia="宋体"/>
+          <w:sz w:val="21"/>
+          <w:szCs w:val="21"/>
+        </w:rPr>
+        <w:t>Figure A14. Stage 4B: accepted and attempted guard steps.</w:t>
+      </w:r>
+    </w:p>
+    <w:p>
+      <w:pPr>
+        <w:jc w:val="center"/>
+      </w:pPr>
+      <w:r>
+        <w:drawing>
+          <wp:inline distT="0" distB="0" distL="0" distR="0">
+            <wp:extent cx="5399405" cy="4566920"/>
+            <wp:effectExtent l="0" t="0" r="10795" b="5080"/>
+            <wp:docPr id="123" name="Figure A15. Stage 4B: unlearning time comparison."/>
+            <wp:cNvGraphicFramePr/>
+            <a:graphic xmlns:a="http://schemas.openxmlformats.org/drawingml/2006/main">
+              <a:graphicData uri="http://schemas.openxmlformats.org/drawingml/2006/picture">
+                <pic:pic xmlns:pic="http://schemas.openxmlformats.org/drawingml/2006/picture">
+                  <pic:nvPicPr>
+                    <pic:cNvPr id="123" name="Figure A15. Stage 4B: unlearning time comparison."/>
+                    <pic:cNvPicPr/>
+                  </pic:nvPicPr>
+                  <pic:blipFill>
+                    <a:blip r:embed="rId23"/>
+                    <a:stretch>
+                      <a:fillRect/>
+                    </a:stretch>
+                  </pic:blipFill>
+                  <pic:spPr>
+                    <a:xfrm>
+                      <a:off x="0" y="0"/>
+                      <a:ext cx="5400000" cy="4567095"/>
+                    </a:xfrm>
+                    <a:prstGeom prst="rect">
+                      <a:avLst/>
+                    </a:prstGeom>
+                  </pic:spPr>
+                </pic:pic>
+              </a:graphicData>
+            </a:graphic>
+          </wp:inline>
+        </w:drawing>
+      </w:r>
+    </w:p>
+    <w:p>
+      <w:pPr>
+        <w:pStyle w:val="5"/>
       </w:pPr>
       <w:r>
         <w:rPr>
@@ -5024,7 +5498,7 @@
                     <pic:cNvPicPr/>
                   </pic:nvPicPr>
                   <pic:blipFill>
-                    <a:blip r:embed="rId21"/>
+                    <a:blip r:embed="rId24"/>
                     <a:stretch>
                       <a:fillRect/>
                     </a:stretch>
@@ -5047,7 +5521,7 @@
     </w:p>
     <w:p>
       <w:pPr>
-        <w:pStyle w:val="4"/>
+        <w:pStyle w:val="5"/>
       </w:pPr>
       <w:r>
         <w:rPr>
@@ -5077,7 +5551,7 @@
                     <pic:cNvPicPr/>
                   </pic:nvPicPr>
                   <pic:blipFill>
-                    <a:blip r:embed="rId19"/>
+                    <a:blip r:embed="rId22"/>
                     <a:stretch>
                       <a:fillRect/>
                     </a:stretch>
@@ -5100,7 +5574,7 @@
     </w:p>
     <w:p>
       <w:pPr>
-        <w:pStyle w:val="4"/>
+        <w:pStyle w:val="5"/>
       </w:pPr>
       <w:r>
         <w:rPr>
@@ -5130,7 +5604,7 @@
                     <pic:cNvPicPr/>
                   </pic:nvPicPr>
                   <pic:blipFill>
-                    <a:blip r:embed="rId22"/>
+                    <a:blip r:embed="rId25"/>
                     <a:stretch>
                       <a:fillRect/>
                     </a:stretch>
@@ -5153,7 +5627,7 @@
     </w:p>
     <w:p>
       <w:pPr>
-        <w:pStyle w:val="4"/>
+        <w:pStyle w:val="5"/>
       </w:pPr>
       <w:r>
         <w:rPr>
@@ -5183,7 +5657,7 @@
                     <pic:cNvPicPr/>
                   </pic:nvPicPr>
                   <pic:blipFill>
-                    <a:blip r:embed="rId23"/>
+                    <a:blip r:embed="rId26"/>
                     <a:stretch>
                       <a:fillRect/>
                     </a:stretch>
@@ -5206,7 +5680,7 @@
     </w:p>
     <w:p>
       <w:pPr>
-        <w:pStyle w:val="4"/>
+        <w:pStyle w:val="5"/>
       </w:pPr>
       <w:r>
         <w:rPr>
@@ -5236,7 +5710,7 @@
                     <pic:cNvPicPr/>
                   </pic:nvPicPr>
                   <pic:blipFill>
-                    <a:blip r:embed="rId24"/>
+                    <a:blip r:embed="rId27"/>
                     <a:stretch>
                       <a:fillRect/>
                     </a:stretch>
@@ -5259,7 +5733,7 @@
     </w:p>
     <w:p>
       <w:pPr>
-        <w:pStyle w:val="4"/>
+        <w:pStyle w:val="5"/>
       </w:pPr>
       <w:r>
         <w:rPr>
@@ -5289,7 +5763,7 @@
                     <pic:cNvPicPr/>
                   </pic:nvPicPr>
                   <pic:blipFill>
-                    <a:blip r:embed="rId25"/>
+                    <a:blip r:embed="rId28"/>
                     <a:stretch>
                       <a:fillRect/>
                     </a:stretch>
@@ -5312,7 +5786,7 @@
     </w:p>
     <w:p>
       <w:pPr>
-        <w:pStyle w:val="4"/>
+        <w:pStyle w:val="5"/>
       </w:pPr>
       <w:r>
         <w:rPr>
@@ -5342,7 +5816,7 @@
                     <pic:cNvPicPr/>
                   </pic:nvPicPr>
                   <pic:blipFill>
-                    <a:blip r:embed="rId26"/>
+                    <a:blip r:embed="rId29"/>
                     <a:stretch>
                       <a:fillRect/>
                     </a:stretch>
@@ -5365,7 +5839,7 @@
     </w:p>
     <w:p>
       <w:pPr>
-        <w:pStyle w:val="4"/>
+        <w:pStyle w:val="5"/>
       </w:pPr>
       <w:r>
         <w:rPr>
@@ -5395,7 +5869,7 @@
                     <pic:cNvPicPr/>
                   </pic:nvPicPr>
                   <pic:blipFill>
-                    <a:blip r:embed="rId27"/>
+                    <a:blip r:embed="rId30"/>
                     <a:stretch>
                       <a:fillRect/>
                     </a:stretch>
@@ -5418,7 +5892,7 @@
     </w:p>
     <w:p>
       <w:pPr>
-        <w:pStyle w:val="4"/>
+        <w:pStyle w:val="5"/>
       </w:pPr>
       <w:r>
         <w:rPr>
@@ -5448,7 +5922,7 @@
                     <pic:cNvPicPr/>
                   </pic:nvPicPr>
                   <pic:blipFill>
-                    <a:blip r:embed="rId28"/>
+                    <a:blip r:embed="rId31"/>
                     <a:stretch>
                       <a:fillRect/>
                     </a:stretch>
@@ -5471,7 +5945,7 @@
     </w:p>
     <w:p>
       <w:pPr>
-        <w:pStyle w:val="4"/>
+        <w:pStyle w:val="5"/>
       </w:pPr>
       <w:r>
         <w:rPr>
@@ -5481,10 +5955,6 @@
         </w:rPr>
         <w:t>Figure A24. Stage 4 seed44: accepted and attempted guard steps.</w:t>
       </w:r>
-    </w:p>
-    <w:p>
-      <w:bookmarkStart w:id="0" w:name="_GoBack"/>
-      <w:bookmarkEnd w:id="0"/>
     </w:p>
     <w:sectPr>
       <w:pgSz w:w="11906" w:h="16838"/>
@@ -5550,7 +6020,7 @@
   <w:docDefaults>
     <w:rPrDefault>
       <w:rPr>
-        <w:rFonts w:asciiTheme="minorHAnsi" w:hAnsiTheme="minorHAnsi" w:eastAsiaTheme="minorEastAsia" w:cstheme="minorBidi"/>
+        <w:rFonts w:ascii="Times New Roman" w:hAnsi="Times New Roman" w:eastAsia="宋体" w:cstheme="minorBidi"/>
       </w:rPr>
     </w:rPrDefault>
     <w:pPrDefault/>
@@ -5559,7 +6029,7 @@
     <w:lsdException w:qFormat="1" w:unhideWhenUsed="0" w:uiPriority="0" w:semiHidden="0" w:name="Normal"/>
     <w:lsdException w:qFormat="1" w:unhideWhenUsed="0" w:uiPriority="0" w:semiHidden="0" w:name="heading 1"/>
     <w:lsdException w:qFormat="1" w:unhideWhenUsed="0" w:uiPriority="0" w:semiHidden="0" w:name="heading 2"/>
-    <w:lsdException w:qFormat="1" w:uiPriority="0" w:name="heading 3"/>
+    <w:lsdException w:qFormat="1" w:unhideWhenUsed="0" w:uiPriority="0" w:semiHidden="0" w:name="heading 3"/>
     <w:lsdException w:qFormat="1" w:uiPriority="0" w:name="heading 4"/>
     <w:lsdException w:qFormat="1" w:uiPriority="0" w:name="heading 5"/>
     <w:lsdException w:qFormat="1" w:uiPriority="0" w:name="heading 6"/>
@@ -5621,7 +6091,7 @@
     <w:lsdException w:qFormat="1" w:unhideWhenUsed="0" w:uiPriority="0" w:semiHidden="0" w:name="Title"/>
     <w:lsdException w:unhideWhenUsed="0" w:uiPriority="0" w:semiHidden="0" w:name="Closing"/>
     <w:lsdException w:unhideWhenUsed="0" w:uiPriority="0" w:semiHidden="0" w:name="Signature"/>
-    <w:lsdException w:unhideWhenUsed="0" w:uiPriority="0" w:name="Default Paragraph Font"/>
+    <w:lsdException w:qFormat="1" w:unhideWhenUsed="0" w:uiPriority="0" w:name="Default Paragraph Font"/>
     <w:lsdException w:unhideWhenUsed="0" w:uiPriority="0" w:semiHidden="0" w:name="Body Text"/>
     <w:lsdException w:unhideWhenUsed="0" w:uiPriority="0" w:semiHidden="0" w:name="Body Text Indent"/>
     <w:lsdException w:unhideWhenUsed="0" w:uiPriority="0" w:semiHidden="0" w:name="List Continue"/>
@@ -5659,7 +6129,7 @@
     <w:lsdException w:unhideWhenUsed="0" w:uiPriority="0" w:semiHidden="0" w:name="HTML Sample"/>
     <w:lsdException w:unhideWhenUsed="0" w:uiPriority="0" w:semiHidden="0" w:name="HTML Typewriter"/>
     <w:lsdException w:unhideWhenUsed="0" w:uiPriority="0" w:semiHidden="0" w:name="HTML Variable"/>
-    <w:lsdException w:unhideWhenUsed="0" w:uiPriority="0" w:name="Normal Table"/>
+    <w:lsdException w:qFormat="1" w:unhideWhenUsed="0" w:uiPriority="0" w:name="Normal Table"/>
     <w:lsdException w:unhideWhenUsed="0" w:uiPriority="0" w:semiHidden="0" w:name="annotation subject"/>
     <w:lsdException w:unhideWhenUsed="0" w:uiPriority="0" w:semiHidden="0" w:name="Table Simple 1"/>
     <w:lsdException w:unhideWhenUsed="0" w:uiPriority="0" w:semiHidden="0" w:name="Table Simple 2"/>
@@ -5857,14 +6327,34 @@
       <w:szCs w:val="28"/>
     </w:rPr>
   </w:style>
-  <w:style w:type="character" w:default="1" w:styleId="6">
+  <w:style w:type="paragraph" w:styleId="4">
+    <w:name w:val="heading 3"/>
+    <w:basedOn w:val="1"/>
+    <w:qFormat/>
+    <w:uiPriority w:val="0"/>
+    <w:pPr>
+      <w:keepNext/>
+      <w:spacing w:before="240" w:after="120" w:line="360" w:lineRule="auto"/>
+      <w:ind w:firstLine="0"/>
+      <w:outlineLvl w:val="2"/>
+    </w:pPr>
+    <w:rPr>
+      <w:rFonts w:ascii="Times New Roman" w:hAnsi="Times New Roman" w:eastAsia="黑体"/>
+      <w:b/>
+      <w:sz w:val="28"/>
+      <w:szCs w:val="28"/>
+    </w:rPr>
+  </w:style>
+  <w:style w:type="character" w:default="1" w:styleId="8">
     <w:name w:val="Default Paragraph Font"/>
     <w:semiHidden/>
+    <w:qFormat/>
     <w:uiPriority w:val="0"/>
   </w:style>
-  <w:style w:type="table" w:default="1" w:styleId="5">
+  <w:style w:type="table" w:default="1" w:styleId="7">
     <w:name w:val="Normal Table"/>
     <w:semiHidden/>
+    <w:qFormat/>
     <w:uiPriority w:val="0"/>
     <w:tblPr>
       <w:tblCellMar>
@@ -5875,7 +6365,7 @@
       </w:tblCellMar>
     </w:tblPr>
   </w:style>
-  <w:style w:type="paragraph" w:styleId="4">
+  <w:style w:type="paragraph" w:styleId="5">
     <w:name w:val="caption"/>
     <w:basedOn w:val="1"/>
     <w:qFormat/>
@@ -5891,7 +6381,24 @@
       <w:szCs w:val="21"/>
     </w:rPr>
   </w:style>
-  <w:style w:type="paragraph" w:customStyle="1" w:styleId="7">
+  <w:style w:type="paragraph" w:styleId="6">
+    <w:name w:val="Title"/>
+    <w:basedOn w:val="1"/>
+    <w:qFormat/>
+    <w:uiPriority w:val="0"/>
+    <w:pPr>
+      <w:spacing w:before="0" w:after="360" w:line="360" w:lineRule="auto"/>
+      <w:ind w:firstLine="0"/>
+      <w:jc w:val="center"/>
+    </w:pPr>
+    <w:rPr>
+      <w:rFonts w:ascii="Times New Roman" w:hAnsi="Times New Roman" w:eastAsia="黑体"/>
+      <w:b/>
+      <w:sz w:val="32"/>
+      <w:szCs w:val="32"/>
+    </w:rPr>
+  </w:style>
+  <w:style w:type="paragraph" w:customStyle="1" w:styleId="9">
     <w:name w:val="BodyNoIndent"/>
     <w:basedOn w:val="1"/>
     <w:qFormat/>
@@ -5902,13 +6409,28 @@
       <w:jc w:val="both"/>
     </w:pPr>
   </w:style>
+  <w:style w:type="paragraph" w:customStyle="1" w:styleId="10">
+    <w:name w:val="TableText"/>
+    <w:basedOn w:val="1"/>
+    <w:uiPriority w:val="0"/>
+    <w:pPr>
+      <w:spacing w:before="0" w:after="0" w:line="300" w:lineRule="auto"/>
+      <w:ind w:firstLine="0"/>
+      <w:jc w:val="center"/>
+    </w:pPr>
+    <w:rPr>
+      <w:rFonts w:ascii="Times New Roman" w:hAnsi="Times New Roman" w:eastAsia="宋体"/>
+      <w:sz w:val="21"/>
+      <w:szCs w:val="21"/>
+    </w:rPr>
+  </w:style>
 </w:styles>
 </file>
 
 <file path=word/theme/theme1.xml><?xml version="1.0" encoding="utf-8"?>
-<a:theme xmlns:a="http://schemas.openxmlformats.org/drawingml/2006/main" name="WPS">
+<a:theme xmlns:a="http://schemas.openxmlformats.org/drawingml/2006/main" name="Office">
   <a:themeElements>
-    <a:clrScheme name="WPS">
+    <a:clrScheme name="Office">
       <a:dk1>
         <a:sysClr val="windowText" lastClr="000000"/>
       </a:dk1>
@@ -5916,39 +6438,39 @@
         <a:sysClr val="window" lastClr="FFFFFF"/>
       </a:lt1>
       <a:dk2>
-        <a:srgbClr val="44546A"/>
+        <a:srgbClr val="1F497D"/>
       </a:dk2>
       <a:lt2>
-        <a:srgbClr val="E7E6E6"/>
+        <a:srgbClr val="EEECE1"/>
       </a:lt2>
       <a:accent1>
-        <a:srgbClr val="4874CB"/>
+        <a:srgbClr val="4F81BD"/>
       </a:accent1>
       <a:accent2>
-        <a:srgbClr val="EE822F"/>
+        <a:srgbClr val="C0504D"/>
       </a:accent2>
       <a:accent3>
-        <a:srgbClr val="F2BA02"/>
+        <a:srgbClr val="9BBB59"/>
       </a:accent3>
       <a:accent4>
-        <a:srgbClr val="75BD42"/>
+        <a:srgbClr val="8064A2"/>
       </a:accent4>
       <a:accent5>
-        <a:srgbClr val="30C0B4"/>
+        <a:srgbClr val="4BACC6"/>
       </a:accent5>
       <a:accent6>
-        <a:srgbClr val="E54C5E"/>
+        <a:srgbClr val="F79646"/>
       </a:accent6>
       <a:hlink>
-        <a:srgbClr val="0026E5"/>
+        <a:srgbClr val="0000FF"/>
       </a:hlink>
       <a:folHlink>
-        <a:srgbClr val="7E1FAD"/>
+        <a:srgbClr val="800080"/>
       </a:folHlink>
     </a:clrScheme>
-    <a:fontScheme name="WPS">
+    <a:fontScheme name="Office">
       <a:majorFont>
-        <a:latin typeface="Calibri Light"/>
+        <a:latin typeface="Cambria"/>
         <a:ea typeface=""/>
         <a:cs typeface=""/>
         <a:font script="Jpan" typeface="游ゴシック Light"/>
@@ -6018,132 +6540,169 @@
         <a:font script="Geor" typeface="Sylfaen"/>
       </a:minorFont>
     </a:fontScheme>
-    <a:fmtScheme name="WPS">
+    <a:fmtScheme name="Office">
       <a:fillStyleLst>
         <a:solidFill>
           <a:schemeClr val="phClr"/>
         </a:solidFill>
-        <a:gradFill>
+        <a:gradFill rotWithShape="1">
           <a:gsLst>
             <a:gs pos="0">
               <a:schemeClr val="phClr">
-                <a:lumOff val="17500"/>
+                <a:tint val="50000"/>
+                <a:satMod val="300000"/>
+              </a:schemeClr>
+            </a:gs>
+            <a:gs pos="35000">
+              <a:schemeClr val="phClr">
+                <a:tint val="37000"/>
+                <a:satMod val="300000"/>
               </a:schemeClr>
             </a:gs>
             <a:gs pos="100000">
-              <a:schemeClr val="phClr"/>
+              <a:schemeClr val="phClr">
+                <a:tint val="15000"/>
+                <a:satMod val="350000"/>
+              </a:schemeClr>
             </a:gs>
           </a:gsLst>
-          <a:lin ang="2700000" scaled="0"/>
+          <a:lin ang="16200000" scaled="1"/>
         </a:gradFill>
-        <a:gradFill>
+        <a:gradFill rotWithShape="1">
           <a:gsLst>
             <a:gs pos="0">
               <a:schemeClr val="phClr">
-                <a:hueOff val="-2520000"/>
+                <a:shade val="51000"/>
+                <a:satMod val="130000"/>
+              </a:schemeClr>
+            </a:gs>
+            <a:gs pos="80000">
+              <a:schemeClr val="phClr">
+                <a:shade val="93000"/>
+                <a:satMod val="130000"/>
               </a:schemeClr>
             </a:gs>
             <a:gs pos="100000">
-              <a:schemeClr val="phClr"/>
+              <a:schemeClr val="phClr">
+                <a:shade val="94000"/>
+                <a:satMod val="135000"/>
+              </a:schemeClr>
             </a:gs>
           </a:gsLst>
-          <a:lin ang="2700000" scaled="0"/>
+          <a:lin ang="16200000" scaled="0"/>
         </a:gradFill>
       </a:fillStyleLst>
       <a:lnStyleLst>
-        <a:ln w="12700" cap="flat" cmpd="sng" algn="ctr">
+        <a:ln w="9525" cap="flat" cmpd="sng" algn="ctr">
+          <a:solidFill>
+            <a:schemeClr val="phClr">
+              <a:shade val="95000"/>
+              <a:satMod val="105000"/>
+            </a:schemeClr>
+          </a:solidFill>
+          <a:prstDash val="solid"/>
+        </a:ln>
+        <a:ln w="25400" cap="flat" cmpd="sng" algn="ctr">
           <a:solidFill>
             <a:schemeClr val="phClr"/>
           </a:solidFill>
           <a:prstDash val="solid"/>
-          <a:miter lim="800000"/>
         </a:ln>
-        <a:ln w="12700" cap="flat" cmpd="sng" algn="ctr">
+        <a:ln w="38100" cap="flat" cmpd="sng" algn="ctr">
           <a:solidFill>
             <a:schemeClr val="phClr"/>
           </a:solidFill>
           <a:prstDash val="solid"/>
-          <a:miter lim="800000"/>
-        </a:ln>
-        <a:ln w="12700" cap="flat" cmpd="sng" algn="ctr">
-          <a:gradFill>
-            <a:gsLst>
-              <a:gs pos="0">
-                <a:schemeClr val="phClr">
-                  <a:hueOff val="-4200000"/>
-                </a:schemeClr>
-              </a:gs>
-              <a:gs pos="100000">
-                <a:schemeClr val="phClr"/>
-              </a:gs>
-            </a:gsLst>
-            <a:lin ang="2700000" scaled="1"/>
-          </a:gradFill>
-          <a:prstDash val="solid"/>
-          <a:miter lim="800000"/>
         </a:ln>
       </a:lnStyleLst>
       <a:effectStyleLst>
         <a:effectStyle>
           <a:effectLst>
-            <a:outerShdw blurRad="101600" dist="50800" dir="5400000" algn="ctr" rotWithShape="0">
-              <a:schemeClr val="phClr">
-                <a:alpha val="60000"/>
-              </a:schemeClr>
+            <a:outerShdw blurRad="40000" dist="20000" dir="5400000" rotWithShape="0">
+              <a:srgbClr val="000000">
+                <a:alpha val="38000"/>
+              </a:srgbClr>
             </a:outerShdw>
           </a:effectLst>
         </a:effectStyle>
         <a:effectStyle>
           <a:effectLst>
-            <a:reflection stA="50000" endA="300" endPos="40000" dist="25400" dir="5400000" sy="-100000" algn="bl" rotWithShape="0"/>
+            <a:outerShdw blurRad="40000" dist="23000" dir="5400000" rotWithShape="0">
+              <a:srgbClr val="000000">
+                <a:alpha val="35000"/>
+              </a:srgbClr>
+            </a:outerShdw>
           </a:effectLst>
         </a:effectStyle>
         <a:effectStyle>
           <a:effectLst>
-            <a:outerShdw blurRad="57150" dist="19050" dir="5400000" algn="ctr" rotWithShape="0">
+            <a:outerShdw blurRad="40000" dist="23000" dir="5400000" rotWithShape="0">
               <a:srgbClr val="000000">
-                <a:alpha val="63000"/>
+                <a:alpha val="35000"/>
               </a:srgbClr>
             </a:outerShdw>
           </a:effectLst>
+          <a:scene3d>
+            <a:camera prst="orthographicFront">
+              <a:rot lat="0" lon="0" rev="0"/>
+            </a:camera>
+            <a:lightRig rig="threePt" dir="t">
+              <a:rot lat="0" lon="0" rev="1200000"/>
+            </a:lightRig>
+          </a:scene3d>
+          <a:sp3d>
+            <a:bevelT w="63500" h="25400"/>
+          </a:sp3d>
         </a:effectStyle>
       </a:effectStyleLst>
       <a:bgFillStyleLst>
         <a:solidFill>
           <a:schemeClr val="phClr"/>
         </a:solidFill>
-        <a:solidFill>
-          <a:schemeClr val="phClr">
-            <a:tint val="95000"/>
-            <a:satMod val="170000"/>
-          </a:schemeClr>
-        </a:solidFill>
         <a:gradFill rotWithShape="1">
           <a:gsLst>
             <a:gs pos="0">
               <a:schemeClr val="phClr">
-                <a:tint val="93000"/>
-                <a:satMod val="150000"/>
-                <a:shade val="98000"/>
-                <a:lumMod val="102000"/>
+                <a:tint val="40000"/>
+                <a:satMod val="350000"/>
               </a:schemeClr>
             </a:gs>
-            <a:gs pos="50000">
+            <a:gs pos="40000">
               <a:schemeClr val="phClr">
-                <a:tint val="98000"/>
-                <a:satMod val="130000"/>
-                <a:shade val="90000"/>
-                <a:lumMod val="103000"/>
+                <a:tint val="45000"/>
+                <a:satMod val="350000"/>
+                <a:shade val="99000"/>
               </a:schemeClr>
             </a:gs>
             <a:gs pos="100000">
               <a:schemeClr val="phClr">
-                <a:shade val="63000"/>
-                <a:satMod val="120000"/>
+                <a:shade val="20000"/>
+                <a:satMod val="255000"/>
               </a:schemeClr>
             </a:gs>
           </a:gsLst>
-          <a:lin ang="5400000" scaled="0"/>
+          <a:path path="circle">
+            <a:fillToRect l="50000" t="-80000" r="50000" b="180000"/>
+          </a:path>
+        </a:gradFill>
+        <a:gradFill rotWithShape="1">
+          <a:gsLst>
+            <a:gs pos="0">
+              <a:schemeClr val="phClr">
+                <a:tint val="80000"/>
+                <a:satMod val="300000"/>
+              </a:schemeClr>
+            </a:gs>
+            <a:gs pos="100000">
+              <a:schemeClr val="phClr">
+                <a:shade val="30000"/>
+                <a:satMod val="200000"/>
+              </a:schemeClr>
+            </a:gs>
+          </a:gsLst>
+          <a:path path="circle">
+            <a:fillToRect l="50000" t="50000" r="50000" b="50000"/>
+          </a:path>
         </a:gradFill>
       </a:bgFillStyleLst>
     </a:fmtScheme>

</xml_diff>